<commit_message>
TASK-01: Added overview to game design document
</commit_message>
<xml_diff>
--- a/docs/Game Design Document.docx
+++ b/docs/Game Design Document.docx
@@ -2010,6 +2010,61 @@
     </w:p>
     <w:p>
       <w:pPr>
+        <w:rPr>
+          <w:lang w:val="en-US"/>
+        </w:rPr>
+      </w:pPr>
+      <w:r>
+        <w:rPr>
+          <w:lang w:val="en-US"/>
+        </w:rPr>
+        <w:t>The target audience for this project is players who are enthusiastic about solving puzzles</w:t>
+      </w:r>
+      <w:r>
+        <w:rPr>
+          <w:lang w:val="en-US"/>
+        </w:rPr>
+        <w:t xml:space="preserve">, </w:t>
+      </w:r>
+      <w:r>
+        <w:rPr>
+          <w:lang w:val="en-US"/>
+        </w:rPr>
+        <w:t xml:space="preserve">challenging their </w:t>
+      </w:r>
+      <w:r>
+        <w:rPr>
+          <w:lang w:val="en-US"/>
+        </w:rPr>
+        <w:t>problem-solving skills and immersing themselves in the story</w:t>
+      </w:r>
+      <w:r>
+        <w:rPr>
+          <w:lang w:val="en-US"/>
+        </w:rPr>
+        <w:t xml:space="preserve">.  </w:t>
+      </w:r>
+      <w:r>
+        <w:rPr>
+          <w:lang w:val="en-US"/>
+        </w:rPr>
+        <w:t>The user in question will want to actively engage with</w:t>
+      </w:r>
+      <w:r>
+        <w:rPr>
+          <w:lang w:val="en-US"/>
+        </w:rPr>
+        <w:t xml:space="preserve"> each web page they load, including the hidden buttons, the contents of </w:t>
+      </w:r>
+      <w:r>
+        <w:rPr>
+          <w:lang w:val="en-US"/>
+        </w:rPr>
+        <w:t xml:space="preserve">the story they are reading, and uncover secrets. </w:t>
+      </w:r>
+    </w:p>
+    <w:p>
+      <w:pPr>
         <w:pStyle w:val="Heading2"/>
         <w:rPr>
           <w:b/>
@@ -2032,6 +2087,25 @@
     </w:p>
     <w:p>
       <w:pPr>
+        <w:rPr>
+          <w:lang w:val="en-US"/>
+        </w:rPr>
+      </w:pPr>
+      <w:r>
+        <w:rPr>
+          <w:lang w:val="en-US"/>
+        </w:rPr>
+        <w:t xml:space="preserve">1D Puzzle game with point and click elements. </w:t>
+      </w:r>
+      <w:r>
+        <w:rPr>
+          <w:lang w:val="en-US"/>
+        </w:rPr>
+        <w:t xml:space="preserve">The game will be featured in black and white. </w:t>
+      </w:r>
+    </w:p>
+    <w:p>
+      <w:pPr>
         <w:pStyle w:val="Heading2"/>
         <w:rPr>
           <w:b/>
@@ -2055,11 +2129,29 @@
     <w:p>
       <w:pPr>
         <w:rPr>
-          <w:b/>
-          <w:bCs/>
           <w:lang w:val="en-US"/>
         </w:rPr>
       </w:pPr>
+      <w:r>
+        <w:rPr>
+          <w:lang w:val="en-US"/>
+        </w:rPr>
+        <w:t xml:space="preserve">This will work as a way to practice my skills with </w:t>
+      </w:r>
+      <w:r>
+        <w:rPr>
+          <w:b/>
+          <w:bCs/>
+          <w:lang w:val="en-US"/>
+        </w:rPr>
+        <w:t>JavaScript React</w:t>
+      </w:r>
+      <w:r>
+        <w:rPr>
+          <w:lang w:val="en-US"/>
+        </w:rPr>
+        <w:t xml:space="preserve">. </w:t>
+      </w:r>
     </w:p>
     <w:p>
       <w:pPr>
@@ -2080,6 +2172,7 @@
           <w:color w:val="auto"/>
           <w:lang w:val="en-US"/>
         </w:rPr>
+        <w:lastRenderedPageBreak/>
         <w:t>Narrative and Goals</w:t>
       </w:r>
       <w:bookmarkEnd w:id="4"/>
@@ -2284,17 +2377,15 @@
         </w:rPr>
         <w:t xml:space="preserve"> &amp; </w:t>
       </w:r>
-      <w:proofErr w:type="spellStart"/>
-      <w:r>
-        <w:rPr>
-          <w:b/>
-          <w:bCs/>
-          <w:color w:val="auto"/>
-          <w:lang w:val="en-US"/>
-        </w:rPr>
-        <w:t>Enviroments</w:t>
-      </w:r>
-      <w:proofErr w:type="spellEnd"/>
+      <w:r>
+        <w:rPr>
+          <w:b/>
+          <w:bCs/>
+          <w:color w:val="auto"/>
+          <w:lang w:val="en-US"/>
+        </w:rPr>
+        <w:t>Environments</w:t>
+      </w:r>
       <w:r>
         <w:rPr>
           <w:b/>

</xml_diff>

<commit_message>
TASK-01: Create Narrative and Goals section & create a few basic character profiles
</commit_message>
<xml_diff>
--- a/docs/Game Design Document.docx
+++ b/docs/Game Design Document.docx
@@ -48,7 +48,7 @@
           <w:lang w:val="en-US"/>
         </w:rPr>
       </w:pPr>
-      <w:hyperlink r:id="rId5" w:history="1">
+      <w:hyperlink r:id="rId6" w:history="1">
         <w:r>
           <w:rPr>
             <w:rStyle w:val="Hyperlink"/>
@@ -66,6 +66,13 @@
     </w:p>
     <w:sdt>
       <w:sdtPr>
+        <w:rPr>
+          <w:rFonts w:asciiTheme="minorHAnsi" w:eastAsiaTheme="minorHAnsi" w:hAnsiTheme="minorHAnsi" w:cstheme="minorBidi"/>
+          <w:color w:val="auto"/>
+          <w:sz w:val="22"/>
+          <w:szCs w:val="22"/>
+          <w:lang w:val="en-AU"/>
+        </w:rPr>
         <w:id w:val="1701427738"/>
         <w:docPartObj>
           <w:docPartGallery w:val="Table of Contents"/>
@@ -74,14 +81,9 @@
       </w:sdtPr>
       <w:sdtEndPr>
         <w:rPr>
-          <w:rFonts w:asciiTheme="minorHAnsi" w:eastAsiaTheme="minorHAnsi" w:hAnsiTheme="minorHAnsi" w:cstheme="minorBidi"/>
           <w:b/>
           <w:bCs/>
           <w:noProof/>
-          <w:color w:val="auto"/>
-          <w:sz w:val="22"/>
-          <w:szCs w:val="22"/>
-          <w:lang w:val="en-AU"/>
         </w:rPr>
       </w:sdtEndPr>
       <w:sdtContent>
@@ -2172,103 +2174,1020 @@
           <w:color w:val="auto"/>
           <w:lang w:val="en-US"/>
         </w:rPr>
+        <w:t>Narrative and Goals</w:t>
+      </w:r>
+      <w:bookmarkEnd w:id="4"/>
+    </w:p>
+    <w:p>
+      <w:pPr>
+        <w:pStyle w:val="Heading2"/>
+        <w:rPr>
+          <w:b/>
+          <w:bCs/>
+          <w:color w:val="auto"/>
+          <w:lang w:val="en-US"/>
+        </w:rPr>
+      </w:pPr>
+      <w:bookmarkStart w:id="5" w:name="_Toc225930482"/>
+      <w:r>
+        <w:rPr>
+          <w:b/>
+          <w:bCs/>
+          <w:color w:val="auto"/>
+          <w:lang w:val="en-US"/>
+        </w:rPr>
+        <w:t>Narrative Goals</w:t>
+      </w:r>
+      <w:bookmarkEnd w:id="5"/>
+    </w:p>
+    <w:p>
+      <w:pPr>
+        <w:rPr>
+          <w:lang w:val="en-US"/>
+        </w:rPr>
+      </w:pPr>
+      <w:r>
+        <w:rPr>
+          <w:lang w:val="en-US"/>
+        </w:rPr>
+        <w:t>The narrative objective is to discover how the mysterious website came to be. It was sent to you by a random person in an e-mail labelled “Important” (This message will appear on the start of the website). Throughout the story, you will learn different facts about people’s lives</w:t>
+      </w:r>
+      <w:r>
+        <w:rPr>
+          <w:lang w:val="en-US"/>
+        </w:rPr>
+        <w:t xml:space="preserve">, and how they have been affected by the software they’ve purchased from “R.E.V.S” (Reliable, empowered, vibrant software), the anti-virus company the main character “John” works at. </w:t>
+      </w:r>
+    </w:p>
+    <w:p>
+      <w:pPr>
+        <w:pStyle w:val="Heading2"/>
+        <w:rPr>
+          <w:b/>
+          <w:bCs/>
+          <w:color w:val="auto"/>
+          <w:lang w:val="en-US"/>
+        </w:rPr>
+      </w:pPr>
+      <w:bookmarkStart w:id="6" w:name="_Toc225930483"/>
+      <w:r>
+        <w:rPr>
+          <w:b/>
+          <w:bCs/>
+          <w:color w:val="auto"/>
+          <w:lang w:val="en-US"/>
+        </w:rPr>
+        <w:t>Player Objectives</w:t>
+      </w:r>
+      <w:bookmarkEnd w:id="6"/>
+      <w:r>
+        <w:rPr>
+          <w:b/>
+          <w:bCs/>
+          <w:color w:val="auto"/>
+          <w:lang w:val="en-US"/>
+        </w:rPr>
+        <w:t xml:space="preserve"> </w:t>
+      </w:r>
+      <w:r>
+        <w:rPr>
+          <w:b/>
+          <w:bCs/>
+          <w:color w:val="auto"/>
+          <w:lang w:val="en-US"/>
+        </w:rPr>
+        <w:t xml:space="preserve"> </w:t>
+      </w:r>
+    </w:p>
+    <w:p>
+      <w:pPr>
+        <w:rPr>
+          <w:lang w:val="en-US"/>
+        </w:rPr>
+      </w:pPr>
+      <w:r>
+        <w:rPr>
+          <w:lang w:val="en-US"/>
+        </w:rPr>
+        <w:t xml:space="preserve">Players need to uncover the secrets of each webpage too make it to the “Final” webpage. Each webpage will have its own little </w:t>
+      </w:r>
+      <w:r>
+        <w:rPr>
+          <w:b/>
+          <w:bCs/>
+          <w:i/>
+          <w:iCs/>
+          <w:lang w:val="en-US"/>
+        </w:rPr>
+        <w:t>“Secret”</w:t>
+      </w:r>
+      <w:r>
+        <w:rPr>
+          <w:lang w:val="en-US"/>
+        </w:rPr>
+        <w:t xml:space="preserve"> that they will need to uncover. </w:t>
+      </w:r>
+      <w:r>
+        <w:rPr>
+          <w:lang w:val="en-US"/>
+        </w:rPr>
+        <w:t>The result</w:t>
+      </w:r>
+      <w:r>
+        <w:rPr>
+          <w:lang w:val="en-US"/>
+        </w:rPr>
+        <w:t xml:space="preserve"> will be that the anti-virus software John is selling is </w:t>
+      </w:r>
+      <w:r>
+        <w:rPr>
+          <w:lang w:val="en-US"/>
+        </w:rPr>
+        <w:t>an</w:t>
+      </w:r>
+      <w:r>
+        <w:rPr>
+          <w:lang w:val="en-US"/>
+        </w:rPr>
+        <w:t xml:space="preserve"> invasive virus, and </w:t>
+      </w:r>
+      <w:r>
+        <w:rPr>
+          <w:lang w:val="en-US"/>
+        </w:rPr>
+        <w:t>the result</w:t>
+      </w:r>
+      <w:r>
+        <w:rPr>
+          <w:lang w:val="en-US"/>
+        </w:rPr>
+        <w:t xml:space="preserve"> will be a choice of if John reveals this too all his customers on his e-mail list, or if he ignores it and continues to sell the software. </w:t>
+      </w:r>
+    </w:p>
+    <w:p>
+      <w:pPr>
+        <w:pStyle w:val="Heading2"/>
+        <w:rPr>
+          <w:b/>
+          <w:bCs/>
+          <w:color w:val="auto"/>
+          <w:lang w:val="en-US"/>
+        </w:rPr>
+      </w:pPr>
+      <w:bookmarkStart w:id="7" w:name="_Toc225930481"/>
+      <w:r>
+        <w:rPr>
+          <w:b/>
+          <w:bCs/>
+          <w:color w:val="auto"/>
+          <w:lang w:val="en-US"/>
+        </w:rPr>
+        <w:t>Characters</w:t>
+      </w:r>
+      <w:bookmarkEnd w:id="7"/>
+      <w:r>
+        <w:rPr>
+          <w:b/>
+          <w:bCs/>
+          <w:color w:val="auto"/>
+          <w:lang w:val="en-US"/>
+        </w:rPr>
+        <w:t xml:space="preserve"> </w:t>
+      </w:r>
+    </w:p>
+    <w:p>
+      <w:pPr>
+        <w:jc w:val="both"/>
+        <w:rPr>
+          <w:b/>
+          <w:bCs/>
+          <w:lang w:val="en-US"/>
+        </w:rPr>
+      </w:pPr>
+      <w:r>
+        <w:rPr>
+          <w:b/>
+          <w:bCs/>
+          <w:lang w:val="en-US"/>
+        </w:rPr>
+        <w:t>John</w:t>
+      </w:r>
+      <w:r>
+        <w:rPr>
+          <w:b/>
+          <w:bCs/>
+          <w:lang w:val="en-US"/>
+        </w:rPr>
+        <w:t xml:space="preserve"> (The playable character) </w:t>
+      </w:r>
+    </w:p>
+    <w:p>
+      <w:pPr>
+        <w:pStyle w:val="ListParagraph"/>
+        <w:numPr>
+          <w:ilvl w:val="0"/>
+          <w:numId w:val="1"/>
+        </w:numPr>
+        <w:jc w:val="both"/>
+        <w:rPr>
+          <w:b/>
+          <w:bCs/>
+          <w:lang w:val="en-US"/>
+        </w:rPr>
+      </w:pPr>
+      <w:r>
+        <w:rPr>
+          <w:b/>
+          <w:bCs/>
+          <w:lang w:val="en-US"/>
+        </w:rPr>
+        <w:t xml:space="preserve">Gender: </w:t>
+      </w:r>
+      <w:r>
+        <w:rPr>
+          <w:lang w:val="en-US"/>
+        </w:rPr>
+        <w:t>Male</w:t>
+      </w:r>
+    </w:p>
+    <w:p>
+      <w:pPr>
+        <w:pStyle w:val="ListParagraph"/>
+        <w:numPr>
+          <w:ilvl w:val="0"/>
+          <w:numId w:val="1"/>
+        </w:numPr>
+        <w:jc w:val="both"/>
+        <w:rPr>
+          <w:b/>
+          <w:bCs/>
+          <w:lang w:val="en-US"/>
+        </w:rPr>
+      </w:pPr>
+      <w:r>
+        <w:rPr>
+          <w:b/>
+          <w:bCs/>
+          <w:lang w:val="en-US"/>
+        </w:rPr>
+        <w:t xml:space="preserve">Age: </w:t>
+      </w:r>
+      <w:r>
+        <w:rPr>
+          <w:lang w:val="en-US"/>
+        </w:rPr>
+        <w:t>26</w:t>
+      </w:r>
+    </w:p>
+    <w:p>
+      <w:pPr>
+        <w:pStyle w:val="ListParagraph"/>
+        <w:numPr>
+          <w:ilvl w:val="0"/>
+          <w:numId w:val="1"/>
+        </w:numPr>
+        <w:jc w:val="both"/>
+        <w:rPr>
+          <w:b/>
+          <w:bCs/>
+          <w:lang w:val="en-US"/>
+        </w:rPr>
+      </w:pPr>
+      <w:r>
+        <w:rPr>
+          <w:b/>
+          <w:bCs/>
+          <w:lang w:val="en-US"/>
+        </w:rPr>
+        <w:t xml:space="preserve">Occupation: </w:t>
+      </w:r>
+      <w:r>
+        <w:rPr>
+          <w:lang w:val="en-US"/>
+        </w:rPr>
+        <w:t xml:space="preserve">Salesman </w:t>
+      </w:r>
+    </w:p>
+    <w:p>
+      <w:pPr>
+        <w:pStyle w:val="ListParagraph"/>
+        <w:numPr>
+          <w:ilvl w:val="0"/>
+          <w:numId w:val="1"/>
+        </w:numPr>
+        <w:jc w:val="both"/>
+        <w:rPr>
+          <w:b/>
+          <w:bCs/>
+          <w:lang w:val="en-US"/>
+        </w:rPr>
+      </w:pPr>
+      <w:r>
+        <w:rPr>
+          <w:b/>
+          <w:bCs/>
+          <w:lang w:val="en-US"/>
+        </w:rPr>
+        <w:t xml:space="preserve">Personality: </w:t>
+      </w:r>
+      <w:r>
+        <w:rPr>
+          <w:lang w:val="en-US"/>
+        </w:rPr>
+        <w:t xml:space="preserve">Arrogant and confident. </w:t>
+      </w:r>
+    </w:p>
+    <w:p>
+      <w:pPr>
+        <w:pStyle w:val="ListParagraph"/>
+        <w:numPr>
+          <w:ilvl w:val="0"/>
+          <w:numId w:val="1"/>
+        </w:numPr>
+        <w:jc w:val="both"/>
+        <w:rPr>
+          <w:b/>
+          <w:bCs/>
+          <w:lang w:val="en-US"/>
+        </w:rPr>
+      </w:pPr>
+      <w:r>
+        <w:rPr>
+          <w:b/>
+          <w:bCs/>
+          <w:lang w:val="en-US"/>
+        </w:rPr>
+        <w:t xml:space="preserve">Strengths: </w:t>
+      </w:r>
+      <w:r>
+        <w:rPr>
+          <w:lang w:val="en-US"/>
+        </w:rPr>
+        <w:t>Great understanding of human behavior</w:t>
+      </w:r>
+      <w:r>
+        <w:rPr>
+          <w:lang w:val="en-US"/>
+        </w:rPr>
+        <w:t>, persuasive, intelligent.</w:t>
+      </w:r>
+      <w:r>
+        <w:rPr>
+          <w:b/>
+          <w:bCs/>
+          <w:lang w:val="en-US"/>
+        </w:rPr>
+        <w:t xml:space="preserve"> </w:t>
+      </w:r>
+    </w:p>
+    <w:p>
+      <w:pPr>
+        <w:pStyle w:val="ListParagraph"/>
+        <w:numPr>
+          <w:ilvl w:val="0"/>
+          <w:numId w:val="1"/>
+        </w:numPr>
+        <w:jc w:val="both"/>
+        <w:rPr>
+          <w:b/>
+          <w:bCs/>
+          <w:lang w:val="en-US"/>
+        </w:rPr>
+      </w:pPr>
+      <w:r>
+        <w:rPr>
+          <w:b/>
+          <w:bCs/>
+          <w:lang w:val="en-US"/>
+        </w:rPr>
+        <w:t xml:space="preserve">Weaknesses: </w:t>
+      </w:r>
+      <w:r>
+        <w:rPr>
+          <w:lang w:val="en-US"/>
+        </w:rPr>
+        <w:t xml:space="preserve">Unfamiliar with the product he is selling, doesn’t ask enough questions. </w:t>
+      </w:r>
+    </w:p>
+    <w:p>
+      <w:pPr>
+        <w:pStyle w:val="ListParagraph"/>
+        <w:numPr>
+          <w:ilvl w:val="0"/>
+          <w:numId w:val="1"/>
+        </w:numPr>
+        <w:jc w:val="both"/>
+        <w:rPr>
+          <w:b/>
+          <w:bCs/>
+          <w:lang w:val="en-US"/>
+        </w:rPr>
+      </w:pPr>
+      <w:r>
+        <w:rPr>
+          <w:b/>
+          <w:bCs/>
+          <w:lang w:val="en-US"/>
+        </w:rPr>
+        <w:t xml:space="preserve">Goals and motivations: </w:t>
+      </w:r>
+      <w:r>
+        <w:rPr>
+          <w:lang w:val="en-US"/>
+        </w:rPr>
+        <w:t xml:space="preserve">Make enough money to pay off debt. </w:t>
+      </w:r>
+    </w:p>
+    <w:p>
+      <w:pPr>
+        <w:pStyle w:val="ListParagraph"/>
+        <w:numPr>
+          <w:ilvl w:val="0"/>
+          <w:numId w:val="1"/>
+        </w:numPr>
+        <w:jc w:val="both"/>
+        <w:rPr>
+          <w:b/>
+          <w:bCs/>
+          <w:lang w:val="en-US"/>
+        </w:rPr>
+      </w:pPr>
+      <w:r>
+        <w:rPr>
+          <w:b/>
+          <w:bCs/>
+          <w:lang w:val="en-US"/>
+        </w:rPr>
+        <w:t xml:space="preserve">Stakes: </w:t>
+      </w:r>
+      <w:r>
+        <w:rPr>
+          <w:lang w:val="en-US"/>
+        </w:rPr>
+        <w:t xml:space="preserve">If he doesn’t sell the software, he can’t afford to pay off his debt. </w:t>
+      </w:r>
+    </w:p>
+    <w:p>
+      <w:pPr>
+        <w:pStyle w:val="ListParagraph"/>
+        <w:numPr>
+          <w:ilvl w:val="0"/>
+          <w:numId w:val="1"/>
+        </w:numPr>
+        <w:jc w:val="both"/>
+        <w:rPr>
+          <w:b/>
+          <w:bCs/>
+          <w:lang w:val="en-US"/>
+        </w:rPr>
+      </w:pPr>
+      <w:r>
+        <w:rPr>
+          <w:b/>
+          <w:bCs/>
+          <w:lang w:val="en-US"/>
+        </w:rPr>
+        <w:t xml:space="preserve">Choices: </w:t>
+      </w:r>
+      <w:r>
+        <w:rPr>
+          <w:lang w:val="en-US"/>
+        </w:rPr>
+        <w:t xml:space="preserve">Expose the software as a virus and keep his job, or expose the software as a virus and loose his job. </w:t>
+      </w:r>
+    </w:p>
+    <w:p>
+      <w:pPr>
+        <w:jc w:val="both"/>
+        <w:rPr>
+          <w:b/>
+          <w:bCs/>
+          <w:lang w:val="en-US"/>
+        </w:rPr>
+      </w:pPr>
+    </w:p>
+    <w:p>
+      <w:pPr>
+        <w:jc w:val="both"/>
+        <w:rPr>
+          <w:b/>
+          <w:bCs/>
+          <w:lang w:val="en-US"/>
+        </w:rPr>
+      </w:pPr>
+      <w:r>
+        <w:rPr>
+          <w:b/>
+          <w:bCs/>
+          <w:lang w:val="en-US"/>
+        </w:rPr>
         <w:lastRenderedPageBreak/>
-        <w:t>Narrative and Goals</w:t>
-      </w:r>
-      <w:bookmarkEnd w:id="4"/>
-    </w:p>
-    <w:p>
-      <w:pPr>
-        <w:pStyle w:val="Heading2"/>
-        <w:rPr>
-          <w:b/>
-          <w:bCs/>
-          <w:color w:val="auto"/>
-          <w:lang w:val="en-US"/>
-        </w:rPr>
-      </w:pPr>
-      <w:bookmarkStart w:id="5" w:name="_Toc225930481"/>
-      <w:r>
-        <w:rPr>
-          <w:b/>
-          <w:bCs/>
-          <w:color w:val="auto"/>
-          <w:lang w:val="en-US"/>
-        </w:rPr>
-        <w:t>Characters</w:t>
-      </w:r>
-      <w:bookmarkEnd w:id="5"/>
-      <w:r>
-        <w:rPr>
-          <w:b/>
-          <w:bCs/>
-          <w:color w:val="auto"/>
+        <w:t xml:space="preserve">Margarete (Elderly customer) </w:t>
+      </w:r>
+    </w:p>
+    <w:p>
+      <w:pPr>
+        <w:pStyle w:val="ListParagraph"/>
+        <w:numPr>
+          <w:ilvl w:val="0"/>
+          <w:numId w:val="1"/>
+        </w:numPr>
+        <w:jc w:val="both"/>
+        <w:rPr>
+          <w:b/>
+          <w:bCs/>
+          <w:lang w:val="en-US"/>
+        </w:rPr>
+      </w:pPr>
+      <w:r>
+        <w:rPr>
+          <w:b/>
+          <w:bCs/>
+          <w:lang w:val="en-US"/>
+        </w:rPr>
+        <w:t>Gender:</w:t>
+      </w:r>
+      <w:r>
+        <w:rPr>
+          <w:b/>
+          <w:bCs/>
           <w:lang w:val="en-US"/>
         </w:rPr>
         <w:t xml:space="preserve"> </w:t>
       </w:r>
-    </w:p>
-    <w:p>
-      <w:pPr>
-        <w:pStyle w:val="Heading2"/>
-        <w:rPr>
-          <w:b/>
-          <w:bCs/>
-          <w:color w:val="auto"/>
-          <w:lang w:val="en-US"/>
-        </w:rPr>
-      </w:pPr>
-      <w:bookmarkStart w:id="6" w:name="_Toc225930482"/>
-      <w:r>
-        <w:rPr>
-          <w:b/>
-          <w:bCs/>
-          <w:color w:val="auto"/>
-          <w:lang w:val="en-US"/>
-        </w:rPr>
-        <w:t>Narrative Goals</w:t>
-      </w:r>
-      <w:bookmarkEnd w:id="6"/>
-    </w:p>
-    <w:p>
-      <w:pPr>
-        <w:pStyle w:val="Heading2"/>
-        <w:rPr>
-          <w:b/>
-          <w:bCs/>
-          <w:color w:val="auto"/>
-          <w:lang w:val="en-US"/>
-        </w:rPr>
-      </w:pPr>
-      <w:bookmarkStart w:id="7" w:name="_Toc225930483"/>
-      <w:r>
-        <w:rPr>
-          <w:b/>
-          <w:bCs/>
-          <w:color w:val="auto"/>
-          <w:lang w:val="en-US"/>
-        </w:rPr>
-        <w:t>Player Objectives</w:t>
-      </w:r>
-      <w:bookmarkEnd w:id="7"/>
-      <w:r>
-        <w:rPr>
-          <w:b/>
-          <w:bCs/>
-          <w:color w:val="auto"/>
+      <w:r>
+        <w:rPr>
+          <w:lang w:val="en-US"/>
+        </w:rPr>
+        <w:t>Female</w:t>
+      </w:r>
+    </w:p>
+    <w:p>
+      <w:pPr>
+        <w:pStyle w:val="ListParagraph"/>
+        <w:numPr>
+          <w:ilvl w:val="0"/>
+          <w:numId w:val="1"/>
+        </w:numPr>
+        <w:jc w:val="both"/>
+        <w:rPr>
+          <w:b/>
+          <w:bCs/>
+          <w:lang w:val="en-US"/>
+        </w:rPr>
+      </w:pPr>
+      <w:r>
+        <w:rPr>
+          <w:b/>
+          <w:bCs/>
+          <w:lang w:val="en-US"/>
+        </w:rPr>
+        <w:t>Age:</w:t>
+      </w:r>
+      <w:r>
+        <w:rPr>
+          <w:b/>
+          <w:bCs/>
           <w:lang w:val="en-US"/>
         </w:rPr>
         <w:t xml:space="preserve"> </w:t>
       </w:r>
       <w:r>
         <w:rPr>
-          <w:b/>
-          <w:bCs/>
-          <w:color w:val="auto"/>
+          <w:lang w:val="en-US"/>
+        </w:rPr>
+        <w:t>80</w:t>
+      </w:r>
+    </w:p>
+    <w:p>
+      <w:pPr>
+        <w:pStyle w:val="ListParagraph"/>
+        <w:numPr>
+          <w:ilvl w:val="0"/>
+          <w:numId w:val="1"/>
+        </w:numPr>
+        <w:jc w:val="both"/>
+        <w:rPr>
+          <w:b/>
+          <w:bCs/>
+          <w:lang w:val="en-US"/>
+        </w:rPr>
+      </w:pPr>
+      <w:r>
+        <w:rPr>
+          <w:b/>
+          <w:bCs/>
+          <w:lang w:val="en-US"/>
+        </w:rPr>
+        <w:t xml:space="preserve">Occupation: </w:t>
+      </w:r>
+      <w:r>
+        <w:rPr>
+          <w:lang w:val="en-US"/>
+        </w:rPr>
+        <w:t xml:space="preserve">Retired cashier, volunteer at op shops. </w:t>
+      </w:r>
+    </w:p>
+    <w:p>
+      <w:pPr>
+        <w:pStyle w:val="ListParagraph"/>
+        <w:numPr>
+          <w:ilvl w:val="0"/>
+          <w:numId w:val="1"/>
+        </w:numPr>
+        <w:jc w:val="both"/>
+        <w:rPr>
+          <w:b/>
+          <w:bCs/>
+          <w:lang w:val="en-US"/>
+        </w:rPr>
+      </w:pPr>
+      <w:r>
+        <w:rPr>
+          <w:b/>
+          <w:bCs/>
+          <w:lang w:val="en-US"/>
+        </w:rPr>
+        <w:t xml:space="preserve">Personality: </w:t>
+      </w:r>
+      <w:r>
+        <w:rPr>
+          <w:lang w:val="en-US"/>
+        </w:rPr>
+        <w:t xml:space="preserve">Trusting, caring, contributing member of the community. </w:t>
+      </w:r>
+    </w:p>
+    <w:p>
+      <w:pPr>
+        <w:pStyle w:val="ListParagraph"/>
+        <w:numPr>
+          <w:ilvl w:val="0"/>
+          <w:numId w:val="1"/>
+        </w:numPr>
+        <w:jc w:val="both"/>
+        <w:rPr>
+          <w:b/>
+          <w:bCs/>
+          <w:lang w:val="en-US"/>
+        </w:rPr>
+      </w:pPr>
+      <w:r>
+        <w:rPr>
+          <w:b/>
+          <w:bCs/>
+          <w:lang w:val="en-US"/>
+        </w:rPr>
+        <w:t xml:space="preserve">Strengths: </w:t>
+      </w:r>
+      <w:r>
+        <w:rPr>
+          <w:lang w:val="en-US"/>
+        </w:rPr>
+        <w:t xml:space="preserve">Always thinking of others, determined, highly social. </w:t>
+      </w:r>
+    </w:p>
+    <w:p>
+      <w:pPr>
+        <w:pStyle w:val="ListParagraph"/>
+        <w:numPr>
+          <w:ilvl w:val="0"/>
+          <w:numId w:val="1"/>
+        </w:numPr>
+        <w:jc w:val="both"/>
+        <w:rPr>
+          <w:b/>
+          <w:bCs/>
+          <w:lang w:val="en-US"/>
+        </w:rPr>
+      </w:pPr>
+      <w:r>
+        <w:rPr>
+          <w:b/>
+          <w:bCs/>
+          <w:lang w:val="en-US"/>
+        </w:rPr>
+        <w:t xml:space="preserve">Weaknesses: </w:t>
+      </w:r>
+      <w:r>
+        <w:rPr>
+          <w:lang w:val="en-US"/>
+        </w:rPr>
+        <w:t xml:space="preserve">Easy to con, overly trusting of strangers. </w:t>
+      </w:r>
+    </w:p>
+    <w:p>
+      <w:pPr>
+        <w:pStyle w:val="ListParagraph"/>
+        <w:numPr>
+          <w:ilvl w:val="0"/>
+          <w:numId w:val="1"/>
+        </w:numPr>
+        <w:jc w:val="both"/>
+        <w:rPr>
+          <w:b/>
+          <w:bCs/>
+          <w:lang w:val="en-US"/>
+        </w:rPr>
+      </w:pPr>
+      <w:r>
+        <w:rPr>
+          <w:b/>
+          <w:bCs/>
+          <w:lang w:val="en-US"/>
+        </w:rPr>
+        <w:t xml:space="preserve">Goals and motivations: </w:t>
+      </w:r>
+      <w:r>
+        <w:rPr>
+          <w:lang w:val="en-US"/>
+        </w:rPr>
+        <w:t xml:space="preserve">Too be a contributing member of society and make the lives of those around her better. </w:t>
+      </w:r>
+    </w:p>
+    <w:p>
+      <w:pPr>
+        <w:ind w:left="360"/>
+        <w:jc w:val="both"/>
+        <w:rPr>
+          <w:b/>
+          <w:bCs/>
+          <w:lang w:val="en-US"/>
+        </w:rPr>
+      </w:pPr>
+      <w:r>
+        <w:rPr>
+          <w:b/>
+          <w:bCs/>
+          <w:lang w:val="en-US"/>
+        </w:rPr>
+        <w:t>Bill</w:t>
+      </w:r>
+      <w:r>
+        <w:rPr>
+          <w:b/>
+          <w:bCs/>
           <w:lang w:val="en-US"/>
         </w:rPr>
         <w:t xml:space="preserve"> </w:t>
       </w:r>
+      <w:r>
+        <w:rPr>
+          <w:b/>
+          <w:bCs/>
+          <w:lang w:val="en-US"/>
+        </w:rPr>
+        <w:t xml:space="preserve">(Owner of a high-end software company) </w:t>
+      </w:r>
+    </w:p>
+    <w:p>
+      <w:pPr>
+        <w:pStyle w:val="ListParagraph"/>
+        <w:numPr>
+          <w:ilvl w:val="0"/>
+          <w:numId w:val="1"/>
+        </w:numPr>
+        <w:jc w:val="both"/>
+        <w:rPr>
+          <w:b/>
+          <w:bCs/>
+          <w:lang w:val="en-US"/>
+        </w:rPr>
+      </w:pPr>
+      <w:r>
+        <w:rPr>
+          <w:b/>
+          <w:bCs/>
+          <w:lang w:val="en-US"/>
+        </w:rPr>
+        <w:t>Gender:</w:t>
+      </w:r>
+      <w:r>
+        <w:rPr>
+          <w:b/>
+          <w:bCs/>
+          <w:lang w:val="en-US"/>
+        </w:rPr>
+        <w:t xml:space="preserve"> </w:t>
+      </w:r>
+      <w:r>
+        <w:rPr>
+          <w:lang w:val="en-US"/>
+        </w:rPr>
+        <w:t>Male</w:t>
+      </w:r>
+    </w:p>
+    <w:p>
+      <w:pPr>
+        <w:pStyle w:val="ListParagraph"/>
+        <w:numPr>
+          <w:ilvl w:val="0"/>
+          <w:numId w:val="1"/>
+        </w:numPr>
+        <w:jc w:val="both"/>
+        <w:rPr>
+          <w:b/>
+          <w:bCs/>
+          <w:lang w:val="en-US"/>
+        </w:rPr>
+      </w:pPr>
+      <w:r>
+        <w:rPr>
+          <w:b/>
+          <w:bCs/>
+          <w:lang w:val="en-US"/>
+        </w:rPr>
+        <w:t xml:space="preserve">Age: </w:t>
+      </w:r>
+      <w:r>
+        <w:rPr>
+          <w:lang w:val="en-US"/>
+        </w:rPr>
+        <w:t>45</w:t>
+      </w:r>
+      <w:r>
+        <w:rPr>
+          <w:lang w:val="en-US"/>
+        </w:rPr>
+        <w:tab/>
+      </w:r>
+    </w:p>
+    <w:p>
+      <w:pPr>
+        <w:pStyle w:val="ListParagraph"/>
+        <w:numPr>
+          <w:ilvl w:val="0"/>
+          <w:numId w:val="1"/>
+        </w:numPr>
+        <w:jc w:val="both"/>
+        <w:rPr>
+          <w:b/>
+          <w:bCs/>
+          <w:lang w:val="en-US"/>
+        </w:rPr>
+      </w:pPr>
+      <w:r>
+        <w:rPr>
+          <w:b/>
+          <w:bCs/>
+          <w:lang w:val="en-US"/>
+        </w:rPr>
+        <w:t xml:space="preserve">Occupation: </w:t>
+      </w:r>
+      <w:r>
+        <w:rPr>
+          <w:lang w:val="en-US"/>
+        </w:rPr>
+        <w:t>Software Company CEO</w:t>
+      </w:r>
+    </w:p>
+    <w:p>
+      <w:pPr>
+        <w:pStyle w:val="ListParagraph"/>
+        <w:numPr>
+          <w:ilvl w:val="0"/>
+          <w:numId w:val="1"/>
+        </w:numPr>
+        <w:jc w:val="both"/>
+        <w:rPr>
+          <w:b/>
+          <w:bCs/>
+          <w:lang w:val="en-US"/>
+        </w:rPr>
+      </w:pPr>
+      <w:r>
+        <w:rPr>
+          <w:b/>
+          <w:bCs/>
+          <w:lang w:val="en-US"/>
+        </w:rPr>
+        <w:t xml:space="preserve">Personality: </w:t>
+      </w:r>
+      <w:r>
+        <w:rPr>
+          <w:lang w:val="en-US"/>
+        </w:rPr>
+        <w:t xml:space="preserve">Firm, direct, tough. </w:t>
+      </w:r>
+    </w:p>
+    <w:p>
+      <w:pPr>
+        <w:pStyle w:val="ListParagraph"/>
+        <w:numPr>
+          <w:ilvl w:val="0"/>
+          <w:numId w:val="1"/>
+        </w:numPr>
+        <w:jc w:val="both"/>
+        <w:rPr>
+          <w:b/>
+          <w:bCs/>
+          <w:lang w:val="en-US"/>
+        </w:rPr>
+      </w:pPr>
+      <w:r>
+        <w:rPr>
+          <w:b/>
+          <w:bCs/>
+          <w:lang w:val="en-US"/>
+        </w:rPr>
+        <w:t xml:space="preserve">Strengths: </w:t>
+      </w:r>
+      <w:r>
+        <w:rPr>
+          <w:lang w:val="en-US"/>
+        </w:rPr>
+        <w:t xml:space="preserve">Can keep a business afloat. </w:t>
+      </w:r>
+    </w:p>
+    <w:p>
+      <w:pPr>
+        <w:pStyle w:val="ListParagraph"/>
+        <w:numPr>
+          <w:ilvl w:val="0"/>
+          <w:numId w:val="1"/>
+        </w:numPr>
+        <w:jc w:val="both"/>
+        <w:rPr>
+          <w:b/>
+          <w:bCs/>
+          <w:lang w:val="en-US"/>
+        </w:rPr>
+      </w:pPr>
+      <w:r>
+        <w:rPr>
+          <w:b/>
+          <w:bCs/>
+          <w:lang w:val="en-US"/>
+        </w:rPr>
+        <w:t xml:space="preserve">Weaknesses: </w:t>
+      </w:r>
+      <w:r>
+        <w:rPr>
+          <w:lang w:val="en-US"/>
+        </w:rPr>
+        <w:t xml:space="preserve">Unfamiliar with anti-virus software, and gets confused by technology. </w:t>
+      </w:r>
+    </w:p>
+    <w:p>
+      <w:pPr>
+        <w:pStyle w:val="ListParagraph"/>
+        <w:numPr>
+          <w:ilvl w:val="0"/>
+          <w:numId w:val="1"/>
+        </w:numPr>
+        <w:jc w:val="both"/>
+        <w:rPr>
+          <w:b/>
+          <w:bCs/>
+          <w:lang w:val="en-US"/>
+        </w:rPr>
+      </w:pPr>
+      <w:r>
+        <w:rPr>
+          <w:b/>
+          <w:bCs/>
+          <w:lang w:val="en-US"/>
+        </w:rPr>
+        <w:t xml:space="preserve">Goals and motivations: </w:t>
+      </w:r>
+      <w:r>
+        <w:rPr>
+          <w:lang w:val="en-US"/>
+        </w:rPr>
+        <w:t xml:space="preserve">Make money for the company and earn a bonus. </w:t>
+      </w:r>
+    </w:p>
+    <w:p>
+      <w:pPr>
+        <w:pStyle w:val="ListParagraph"/>
+        <w:jc w:val="both"/>
+        <w:rPr>
+          <w:b/>
+          <w:bCs/>
+          <w:lang w:val="en-US"/>
+        </w:rPr>
+      </w:pPr>
+    </w:p>
+    <w:p>
+      <w:pPr>
+        <w:pStyle w:val="ListParagraph"/>
+        <w:ind w:left="1440"/>
+        <w:jc w:val="both"/>
+        <w:rPr>
+          <w:b/>
+          <w:bCs/>
+          <w:lang w:val="en-US"/>
+        </w:rPr>
+      </w:pPr>
+    </w:p>
+    <w:p>
+      <w:pPr>
+        <w:pStyle w:val="Heading3"/>
+        <w:rPr>
+          <w:b/>
+          <w:bCs/>
+          <w:lang w:val="en-US"/>
+        </w:rPr>
+      </w:pPr>
     </w:p>
     <w:p>
       <w:pPr>
@@ -2406,8 +3325,8 @@
           <w:lang w:val="en-US"/>
         </w:rPr>
       </w:pPr>
-      <w:bookmarkStart w:id="12" w:name="_Toc225930488"/>
-      <w:bookmarkStart w:id="13" w:name="_Toc225930491"/>
+      <w:bookmarkStart w:id="12" w:name="_Toc225930491"/>
+      <w:bookmarkStart w:id="13" w:name="_Toc225930488"/>
       <w:r>
         <w:rPr>
           <w:b/>
@@ -2417,68 +3336,68 @@
         </w:rPr>
         <w:t>Themes</w:t>
       </w:r>
+      <w:bookmarkEnd w:id="12"/>
+      <w:r>
+        <w:rPr>
+          <w:b/>
+          <w:bCs/>
+          <w:color w:val="auto"/>
+          <w:lang w:val="en-US"/>
+        </w:rPr>
+        <w:t xml:space="preserve"> </w:t>
+      </w:r>
+    </w:p>
+    <w:p>
+      <w:pPr>
+        <w:pStyle w:val="Heading2"/>
+        <w:rPr>
+          <w:b/>
+          <w:bCs/>
+          <w:color w:val="auto"/>
+          <w:lang w:val="en-US"/>
+        </w:rPr>
+      </w:pPr>
+      <w:bookmarkStart w:id="14" w:name="_Toc225930492"/>
+      <w:r>
+        <w:rPr>
+          <w:b/>
+          <w:bCs/>
+          <w:color w:val="auto"/>
+          <w:lang w:val="en-US"/>
+        </w:rPr>
+        <w:t>Item placements and patterns</w:t>
+      </w:r>
+      <w:bookmarkEnd w:id="14"/>
+      <w:r>
+        <w:rPr>
+          <w:b/>
+          <w:bCs/>
+          <w:color w:val="auto"/>
+          <w:lang w:val="en-US"/>
+        </w:rPr>
+        <w:t xml:space="preserve"> </w:t>
+      </w:r>
+    </w:p>
+    <w:p>
+      <w:pPr>
+        <w:pStyle w:val="Heading2"/>
+        <w:rPr>
+          <w:b/>
+          <w:bCs/>
+          <w:color w:val="auto"/>
+          <w:lang w:val="en-US"/>
+        </w:rPr>
+      </w:pPr>
+      <w:r>
+        <w:rPr>
+          <w:b/>
+          <w:bCs/>
+          <w:color w:val="auto"/>
+          <w:lang w:val="en-US"/>
+        </w:rPr>
+        <w:t>Power-ups</w:t>
+      </w:r>
       <w:bookmarkEnd w:id="13"/>
-      <w:r>
-        <w:rPr>
-          <w:b/>
-          <w:bCs/>
-          <w:color w:val="auto"/>
-          <w:lang w:val="en-US"/>
-        </w:rPr>
-        <w:t xml:space="preserve"> </w:t>
-      </w:r>
-    </w:p>
-    <w:p>
-      <w:pPr>
-        <w:pStyle w:val="Heading2"/>
-        <w:rPr>
-          <w:b/>
-          <w:bCs/>
-          <w:color w:val="auto"/>
-          <w:lang w:val="en-US"/>
-        </w:rPr>
-      </w:pPr>
-      <w:bookmarkStart w:id="14" w:name="_Toc225930492"/>
-      <w:r>
-        <w:rPr>
-          <w:b/>
-          <w:bCs/>
-          <w:color w:val="auto"/>
-          <w:lang w:val="en-US"/>
-        </w:rPr>
-        <w:t>Item placements and patterns</w:t>
-      </w:r>
-      <w:bookmarkEnd w:id="14"/>
-      <w:r>
-        <w:rPr>
-          <w:b/>
-          <w:bCs/>
-          <w:color w:val="auto"/>
-          <w:lang w:val="en-US"/>
-        </w:rPr>
-        <w:t xml:space="preserve"> </w:t>
-      </w:r>
-    </w:p>
-    <w:p>
-      <w:pPr>
-        <w:pStyle w:val="Heading2"/>
-        <w:rPr>
-          <w:b/>
-          <w:bCs/>
-          <w:color w:val="auto"/>
-          <w:lang w:val="en-US"/>
-        </w:rPr>
-      </w:pPr>
-      <w:r>
-        <w:rPr>
-          <w:b/>
-          <w:bCs/>
-          <w:color w:val="auto"/>
-          <w:lang w:val="en-US"/>
-        </w:rPr>
-        <w:t>Power-ups</w:t>
-      </w:r>
-      <w:bookmarkEnd w:id="12"/>
     </w:p>
     <w:p>
       <w:pPr>
@@ -2652,6 +3571,126 @@
     </w:sectPr>
   </w:body>
 </w:document>
+</file>
+
+<file path=word/numbering.xml><?xml version="1.0" encoding="utf-8"?>
+<w:numbering xmlns:wpc="http://schemas.microsoft.com/office/word/2010/wordprocessingCanvas" xmlns:cx="http://schemas.microsoft.com/office/drawing/2014/chartex" xmlns:cx1="http://schemas.microsoft.com/office/drawing/2015/9/8/chartex" xmlns:cx2="http://schemas.microsoft.com/office/drawing/2015/10/21/chartex" xmlns:cx3="http://schemas.microsoft.com/office/drawing/2016/5/9/chartex" xmlns:cx4="http://schemas.microsoft.com/office/drawing/2016/5/10/chartex" xmlns:cx5="http://schemas.microsoft.com/office/drawing/2016/5/11/chartex" xmlns:cx6="http://schemas.microsoft.com/office/drawing/2016/5/12/chartex" xmlns:cx7="http://schemas.microsoft.com/office/drawing/2016/5/13/chartex" xmlns:cx8="http://schemas.microsoft.com/office/drawing/2016/5/14/chartex" xmlns:mc="http://schemas.openxmlformats.org/markup-compatibility/2006" xmlns:aink="http://schemas.microsoft.com/office/drawing/2016/ink" xmlns:am3d="http://schemas.microsoft.com/office/drawing/2017/model3d" xmlns:o="urn:schemas-microsoft-com:office:office" xmlns:oel="http://schemas.microsoft.com/office/2019/extlst" xmlns:r="http://schemas.openxmlformats.org/officeDocument/2006/relationships" xmlns:m="http://schemas.openxmlformats.org/officeDocument/2006/math" xmlns:v="urn:schemas-microsoft-com:vml" xmlns:wp14="http://schemas.microsoft.com/office/word/2010/wordprocessingDrawing" xmlns:wp="http://schemas.openxmlformats.org/drawingml/2006/wordprocessingDrawing" xmlns:w10="urn:schemas-microsoft-com:office:word" xmlns:w="http://schemas.openxmlformats.org/wordprocessingml/2006/main" xmlns:w14="http://schemas.microsoft.com/office/word/2010/wordml" xmlns:w15="http://schemas.microsoft.com/office/word/2012/wordml" xmlns:w16cex="http://schemas.microsoft.com/office/word/2018/wordml/cex" xmlns:w16cid="http://schemas.microsoft.com/office/word/2016/wordml/cid" xmlns:w16="http://schemas.microsoft.com/office/word/2018/wordml" xmlns:w16du="http://schemas.microsoft.com/office/word/2023/wordml/word16du" xmlns:w16sdtdh="http://schemas.microsoft.com/office/word/2020/wordml/sdtdatahash" xmlns:w16sdtfl="http://schemas.microsoft.com/office/word/2024/wordml/sdtformatlock" xmlns:w16se="http://schemas.microsoft.com/office/word/2015/wordml/symex" xmlns:wpg="http://schemas.microsoft.com/office/word/2010/wordprocessingGroup" xmlns:wpi="http://schemas.microsoft.com/office/word/2010/wordprocessingInk" xmlns:wne="http://schemas.microsoft.com/office/word/2006/wordml" xmlns:wps="http://schemas.microsoft.com/office/word/2010/wordprocessingShape" mc:Ignorable="w14 w15 w16se w16cid w16 w16cex w16sdtdh w16sdtfl w16du wp14">
+  <w:abstractNum w:abstractNumId="0" w15:restartNumberingAfterBreak="0">
+    <w:nsid w:val="6B295F11"/>
+    <w:multiLevelType w:val="hybridMultilevel"/>
+    <w:tmpl w:val="564C1654"/>
+    <w:lvl w:ilvl="0" w:tplc="879AAEAA">
+      <w:numFmt w:val="bullet"/>
+      <w:lvlText w:val="-"/>
+      <w:lvlJc w:val="left"/>
+      <w:pPr>
+        <w:ind w:left="720" w:hanging="360"/>
+      </w:pPr>
+      <w:rPr>
+        <w:rFonts w:ascii="Aptos" w:eastAsiaTheme="minorHAnsi" w:hAnsi="Aptos" w:cstheme="minorBidi" w:hint="default"/>
+      </w:rPr>
+    </w:lvl>
+    <w:lvl w:ilvl="1" w:tplc="0C090003">
+      <w:start w:val="1"/>
+      <w:numFmt w:val="bullet"/>
+      <w:lvlText w:val="o"/>
+      <w:lvlJc w:val="left"/>
+      <w:pPr>
+        <w:ind w:left="1440" w:hanging="360"/>
+      </w:pPr>
+      <w:rPr>
+        <w:rFonts w:ascii="Courier New" w:hAnsi="Courier New" w:cs="Courier New" w:hint="default"/>
+      </w:rPr>
+    </w:lvl>
+    <w:lvl w:ilvl="2" w:tplc="0C090005" w:tentative="1">
+      <w:start w:val="1"/>
+      <w:numFmt w:val="bullet"/>
+      <w:lvlText w:val=""/>
+      <w:lvlJc w:val="left"/>
+      <w:pPr>
+        <w:ind w:left="2160" w:hanging="360"/>
+      </w:pPr>
+      <w:rPr>
+        <w:rFonts w:ascii="Wingdings" w:hAnsi="Wingdings" w:hint="default"/>
+      </w:rPr>
+    </w:lvl>
+    <w:lvl w:ilvl="3" w:tplc="0C090001" w:tentative="1">
+      <w:start w:val="1"/>
+      <w:numFmt w:val="bullet"/>
+      <w:lvlText w:val=""/>
+      <w:lvlJc w:val="left"/>
+      <w:pPr>
+        <w:ind w:left="2880" w:hanging="360"/>
+      </w:pPr>
+      <w:rPr>
+        <w:rFonts w:ascii="Symbol" w:hAnsi="Symbol" w:hint="default"/>
+      </w:rPr>
+    </w:lvl>
+    <w:lvl w:ilvl="4" w:tplc="0C090003" w:tentative="1">
+      <w:start w:val="1"/>
+      <w:numFmt w:val="bullet"/>
+      <w:lvlText w:val="o"/>
+      <w:lvlJc w:val="left"/>
+      <w:pPr>
+        <w:ind w:left="3600" w:hanging="360"/>
+      </w:pPr>
+      <w:rPr>
+        <w:rFonts w:ascii="Courier New" w:hAnsi="Courier New" w:cs="Courier New" w:hint="default"/>
+      </w:rPr>
+    </w:lvl>
+    <w:lvl w:ilvl="5" w:tplc="0C090005" w:tentative="1">
+      <w:start w:val="1"/>
+      <w:numFmt w:val="bullet"/>
+      <w:lvlText w:val=""/>
+      <w:lvlJc w:val="left"/>
+      <w:pPr>
+        <w:ind w:left="4320" w:hanging="360"/>
+      </w:pPr>
+      <w:rPr>
+        <w:rFonts w:ascii="Wingdings" w:hAnsi="Wingdings" w:hint="default"/>
+      </w:rPr>
+    </w:lvl>
+    <w:lvl w:ilvl="6" w:tplc="0C090001" w:tentative="1">
+      <w:start w:val="1"/>
+      <w:numFmt w:val="bullet"/>
+      <w:lvlText w:val=""/>
+      <w:lvlJc w:val="left"/>
+      <w:pPr>
+        <w:ind w:left="5040" w:hanging="360"/>
+      </w:pPr>
+      <w:rPr>
+        <w:rFonts w:ascii="Symbol" w:hAnsi="Symbol" w:hint="default"/>
+      </w:rPr>
+    </w:lvl>
+    <w:lvl w:ilvl="7" w:tplc="0C090003" w:tentative="1">
+      <w:start w:val="1"/>
+      <w:numFmt w:val="bullet"/>
+      <w:lvlText w:val="o"/>
+      <w:lvlJc w:val="left"/>
+      <w:pPr>
+        <w:ind w:left="5760" w:hanging="360"/>
+      </w:pPr>
+      <w:rPr>
+        <w:rFonts w:ascii="Courier New" w:hAnsi="Courier New" w:cs="Courier New" w:hint="default"/>
+      </w:rPr>
+    </w:lvl>
+    <w:lvl w:ilvl="8" w:tplc="0C090005" w:tentative="1">
+      <w:start w:val="1"/>
+      <w:numFmt w:val="bullet"/>
+      <w:lvlText w:val=""/>
+      <w:lvlJc w:val="left"/>
+      <w:pPr>
+        <w:ind w:left="6480" w:hanging="360"/>
+      </w:pPr>
+      <w:rPr>
+        <w:rFonts w:ascii="Wingdings" w:hAnsi="Wingdings" w:hint="default"/>
+      </w:rPr>
+    </w:lvl>
+  </w:abstractNum>
+  <w:num w:numId="1" w16cid:durableId="753666516">
+    <w:abstractNumId w:val="0"/>
+  </w:num>
+</w:numbering>
 </file>
 
 <file path=word/styles.xml><?xml version="1.0" encoding="utf-8"?>
@@ -3102,7 +4141,6 @@
     <w:next w:val="Normal"/>
     <w:link w:val="Heading3Char"/>
     <w:uiPriority w:val="9"/>
-    <w:semiHidden/>
     <w:unhideWhenUsed/>
     <w:qFormat/>
     <w:rsid w:val="00FD2DB4"/>
@@ -3254,6 +4292,7 @@
   <w:style w:type="character" w:default="1" w:styleId="DefaultParagraphFont">
     <w:name w:val="Default Paragraph Font"/>
     <w:uiPriority w:val="1"/>
+    <w:semiHidden/>
     <w:unhideWhenUsed/>
   </w:style>
   <w:style w:type="table" w:default="1" w:styleId="TableNormal">
@@ -3308,7 +4347,6 @@
     <w:basedOn w:val="DefaultParagraphFont"/>
     <w:link w:val="Heading3"/>
     <w:uiPriority w:val="9"/>
-    <w:semiHidden/>
     <w:rsid w:val="00FD2DB4"/>
     <w:rPr>
       <w:rFonts w:eastAsiaTheme="majorEastAsia" w:cstheme="majorBidi"/>

</xml_diff>

<commit_message>
TASK-01: Fill out Art and sound Components section
</commit_message>
<xml_diff>
--- a/docs/Game Design Document.docx
+++ b/docs/Game Design Document.docx
@@ -3169,18 +3169,6 @@
     </w:p>
     <w:p>
       <w:pPr>
-        <w:pStyle w:val="ListParagraph"/>
-        <w:ind w:left="1440"/>
-        <w:jc w:val="both"/>
-        <w:rPr>
-          <w:b/>
-          <w:bCs/>
-          <w:lang w:val="en-US"/>
-        </w:rPr>
-      </w:pPr>
-    </w:p>
-    <w:p>
-      <w:pPr>
         <w:pStyle w:val="Heading3"/>
         <w:rPr>
           <w:b/>
@@ -3236,6 +3224,32 @@
     </w:p>
     <w:p>
       <w:pPr>
+        <w:rPr>
+          <w:lang w:val="en-US"/>
+        </w:rPr>
+      </w:pPr>
+      <w:r>
+        <w:rPr>
+          <w:lang w:val="en-US"/>
+        </w:rPr>
+        <w:t xml:space="preserve">The game is going to use basic 2D shapes and buttons in a black and white format (As per the requirements of the game jam). </w:t>
+      </w:r>
+      <w:r>
+        <w:rPr>
+          <w:lang w:val="en-US"/>
+        </w:rPr>
+        <w:t xml:space="preserve">As for sounds, they will be basic click sounds when you interact with specific elements. </w:t>
+      </w:r>
+    </w:p>
+    <w:p>
+      <w:pPr>
+        <w:rPr>
+          <w:lang w:val="en-US"/>
+        </w:rPr>
+      </w:pPr>
+    </w:p>
+    <w:p>
+      <w:pPr>
         <w:pStyle w:val="Heading2"/>
         <w:rPr>
           <w:b/>
@@ -3255,6 +3269,45 @@
         <w:t>Character Design</w:t>
       </w:r>
       <w:bookmarkEnd w:id="10"/>
+    </w:p>
+    <w:p>
+      <w:pPr>
+        <w:rPr>
+          <w:lang w:val="en-US"/>
+        </w:rPr>
+      </w:pPr>
+      <w:r>
+        <w:rPr>
+          <w:lang w:val="en-US"/>
+        </w:rPr>
+        <w:t xml:space="preserve">Physical elements of the characters will not be visible. Instead, the designs will mostly just be shapes and buttons on a website. This is </w:t>
+      </w:r>
+      <w:r>
+        <w:rPr>
+          <w:lang w:val="en-US"/>
+        </w:rPr>
+        <w:t xml:space="preserve">designed this way to specifically focus on creating and deploying a JavaScript React App as a game for the first time. </w:t>
+      </w:r>
+      <w:r>
+        <w:rPr>
+          <w:lang w:val="en-US"/>
+        </w:rPr>
+        <w:t xml:space="preserve">Instead, characters will be brought </w:t>
+      </w:r>
+      <w:proofErr w:type="spellStart"/>
+      <w:r>
+        <w:rPr>
+          <w:lang w:val="en-US"/>
+        </w:rPr>
+        <w:t>too</w:t>
+      </w:r>
+      <w:proofErr w:type="spellEnd"/>
+      <w:r>
+        <w:rPr>
+          <w:lang w:val="en-US"/>
+        </w:rPr>
+        <w:t xml:space="preserve"> life through text. </w:t>
+      </w:r>
     </w:p>
     <w:p>
       <w:pPr>
@@ -3274,6 +3327,7 @@
           <w:color w:val="auto"/>
           <w:lang w:val="en-US"/>
         </w:rPr>
+        <w:lastRenderedPageBreak/>
         <w:t xml:space="preserve"> </w:t>
       </w:r>
       <w:bookmarkStart w:id="11" w:name="_Toc225930487"/>

</xml_diff>

<commit_message>
TASK-01: Fill out the Level Gameplay and Environments section
</commit_message>
<xml_diff>
--- a/docs/Game Design Document.docx
+++ b/docs/Game Design Document.docx
@@ -2138,7 +2138,21 @@
         <w:rPr>
           <w:lang w:val="en-US"/>
         </w:rPr>
-        <w:t xml:space="preserve">This will work as a way to practice my skills with </w:t>
+        <w:t xml:space="preserve">This will work </w:t>
+      </w:r>
+      <w:proofErr w:type="gramStart"/>
+      <w:r>
+        <w:rPr>
+          <w:lang w:val="en-US"/>
+        </w:rPr>
+        <w:t>as a way to</w:t>
+      </w:r>
+      <w:proofErr w:type="gramEnd"/>
+      <w:r>
+        <w:rPr>
+          <w:lang w:val="en-US"/>
+        </w:rPr>
+        <w:t xml:space="preserve"> practice my skills with </w:t>
       </w:r>
       <w:r>
         <w:rPr>
@@ -2566,7 +2580,21 @@
         <w:rPr>
           <w:lang w:val="en-US"/>
         </w:rPr>
-        <w:t xml:space="preserve">Unfamiliar with the product he is selling, doesn’t ask enough questions. </w:t>
+        <w:t xml:space="preserve">Unfamiliar with the product he is selling, </w:t>
+      </w:r>
+      <w:proofErr w:type="gramStart"/>
+      <w:r>
+        <w:rPr>
+          <w:lang w:val="en-US"/>
+        </w:rPr>
+        <w:t>doesn’t</w:t>
+      </w:r>
+      <w:proofErr w:type="gramEnd"/>
+      <w:r>
+        <w:rPr>
+          <w:lang w:val="en-US"/>
+        </w:rPr>
+        <w:t xml:space="preserve"> ask enough questions. </w:t>
       </w:r>
     </w:p>
     <w:p>
@@ -2653,7 +2681,35 @@
         <w:rPr>
           <w:lang w:val="en-US"/>
         </w:rPr>
-        <w:t xml:space="preserve">Expose the software as a virus and keep his job, or expose the software as a virus and loose his job. </w:t>
+        <w:t xml:space="preserve">Expose the software as a virus and keep his </w:t>
+      </w:r>
+      <w:proofErr w:type="gramStart"/>
+      <w:r>
+        <w:rPr>
+          <w:lang w:val="en-US"/>
+        </w:rPr>
+        <w:t>job, or</w:t>
+      </w:r>
+      <w:proofErr w:type="gramEnd"/>
+      <w:r>
+        <w:rPr>
+          <w:lang w:val="en-US"/>
+        </w:rPr>
+        <w:t xml:space="preserve"> expose the software as a virus and </w:t>
+      </w:r>
+      <w:proofErr w:type="gramStart"/>
+      <w:r>
+        <w:rPr>
+          <w:lang w:val="en-US"/>
+        </w:rPr>
+        <w:t>loose</w:t>
+      </w:r>
+      <w:proofErr w:type="gramEnd"/>
+      <w:r>
+        <w:rPr>
+          <w:lang w:val="en-US"/>
+        </w:rPr>
+        <w:t xml:space="preserve"> his job. </w:t>
       </w:r>
     </w:p>
     <w:p>
@@ -2814,7 +2870,21 @@
         <w:rPr>
           <w:lang w:val="en-US"/>
         </w:rPr>
-        <w:t xml:space="preserve">Trusting, caring, contributing member of the community. </w:t>
+        <w:t xml:space="preserve">Trusting, caring, </w:t>
+      </w:r>
+      <w:proofErr w:type="gramStart"/>
+      <w:r>
+        <w:rPr>
+          <w:lang w:val="en-US"/>
+        </w:rPr>
+        <w:t>contributing member of</w:t>
+      </w:r>
+      <w:proofErr w:type="gramEnd"/>
+      <w:r>
+        <w:rPr>
+          <w:lang w:val="en-US"/>
+        </w:rPr>
+        <w:t xml:space="preserve"> the community. </w:t>
       </w:r>
     </w:p>
     <w:p>
@@ -3124,7 +3194,21 @@
         <w:rPr>
           <w:lang w:val="en-US"/>
         </w:rPr>
-        <w:t xml:space="preserve">Unfamiliar with anti-virus software, and gets confused by technology. </w:t>
+        <w:t xml:space="preserve">Unfamiliar with anti-virus </w:t>
+      </w:r>
+      <w:proofErr w:type="gramStart"/>
+      <w:r>
+        <w:rPr>
+          <w:lang w:val="en-US"/>
+        </w:rPr>
+        <w:t>software, and</w:t>
+      </w:r>
+      <w:proofErr w:type="gramEnd"/>
+      <w:r>
+        <w:rPr>
+          <w:lang w:val="en-US"/>
+        </w:rPr>
+        <w:t xml:space="preserve"> gets confused by technology. </w:t>
       </w:r>
     </w:p>
     <w:p>
@@ -3158,17 +3242,6 @@
     </w:p>
     <w:p>
       <w:pPr>
-        <w:pStyle w:val="ListParagraph"/>
-        <w:jc w:val="both"/>
-        <w:rPr>
-          <w:b/>
-          <w:bCs/>
-          <w:lang w:val="en-US"/>
-        </w:rPr>
-      </w:pPr>
-    </w:p>
-    <w:p>
-      <w:pPr>
         <w:pStyle w:val="Heading3"/>
         <w:rPr>
           <w:b/>
@@ -3295,6 +3368,7 @@
         <w:t xml:space="preserve">Instead, characters will be brought </w:t>
       </w:r>
       <w:proofErr w:type="spellStart"/>
+      <w:proofErr w:type="gramStart"/>
       <w:r>
         <w:rPr>
           <w:lang w:val="en-US"/>
@@ -3302,6 +3376,7 @@
         <w:t>too</w:t>
       </w:r>
       <w:proofErr w:type="spellEnd"/>
+      <w:proofErr w:type="gramEnd"/>
       <w:r>
         <w:rPr>
           <w:lang w:val="en-US"/>
@@ -3327,7 +3402,6 @@
           <w:color w:val="auto"/>
           <w:lang w:val="en-US"/>
         </w:rPr>
-        <w:lastRenderedPageBreak/>
         <w:t xml:space="preserve"> </w:t>
       </w:r>
       <w:bookmarkStart w:id="11" w:name="_Toc225930487"/>
@@ -3403,6 +3477,31 @@
     </w:p>
     <w:p>
       <w:pPr>
+        <w:rPr>
+          <w:lang w:val="en-US"/>
+        </w:rPr>
+      </w:pPr>
+      <w:r>
+        <w:rPr>
+          <w:lang w:val="en-US"/>
+        </w:rPr>
+        <w:t xml:space="preserve">The themes that will be explored in this game are the elements of Good Vs. Evil, coping with loss, and redefining a sense of identity. These themes will be expressed through </w:t>
+      </w:r>
+      <w:r>
+        <w:rPr>
+          <w:lang w:val="en-US"/>
+        </w:rPr>
+        <w:t>dialogue</w:t>
+      </w:r>
+      <w:r>
+        <w:rPr>
+          <w:lang w:val="en-US"/>
+        </w:rPr>
+        <w:t xml:space="preserve"> on the screen, and the inevitable choice the user will have to make at the end of the game. </w:t>
+      </w:r>
+    </w:p>
+    <w:p>
+      <w:pPr>
         <w:pStyle w:val="Heading2"/>
         <w:rPr>
           <w:b/>
@@ -3419,6 +3518,7 @@
           <w:color w:val="auto"/>
           <w:lang w:val="en-US"/>
         </w:rPr>
+        <w:lastRenderedPageBreak/>
         <w:t>Item placements and patterns</w:t>
       </w:r>
       <w:bookmarkEnd w:id="14"/>
@@ -3434,6 +3534,25 @@
     </w:p>
     <w:p>
       <w:pPr>
+        <w:rPr>
+          <w:lang w:val="en-US"/>
+        </w:rPr>
+      </w:pPr>
+      <w:r>
+        <w:rPr>
+          <w:lang w:val="en-US"/>
+        </w:rPr>
+        <w:t xml:space="preserve">Users will be </w:t>
+      </w:r>
+      <w:r>
+        <w:rPr>
+          <w:lang w:val="en-US"/>
+        </w:rPr>
+        <w:t xml:space="preserve">required to select certain text and objects on screen that don’t seem to match what they are supposed to be seeing. Players will have to utilize pattern-matching abilities to uncover secrets. </w:t>
+      </w:r>
+    </w:p>
+    <w:p>
+      <w:pPr>
         <w:pStyle w:val="Heading2"/>
         <w:rPr>
           <w:b/>
@@ -3455,6 +3574,19 @@
     </w:p>
     <w:p>
       <w:pPr>
+        <w:rPr>
+          <w:lang w:val="en-US"/>
+        </w:rPr>
+      </w:pPr>
+      <w:r>
+        <w:rPr>
+          <w:lang w:val="en-US"/>
+        </w:rPr>
+        <w:t xml:space="preserve">None. </w:t>
+      </w:r>
+    </w:p>
+    <w:p>
+      <w:pPr>
         <w:pStyle w:val="Heading2"/>
         <w:rPr>
           <w:b/>
@@ -3486,6 +3618,19 @@
     </w:p>
     <w:p>
       <w:pPr>
+        <w:rPr>
+          <w:lang w:val="en-US"/>
+        </w:rPr>
+      </w:pPr>
+      <w:r>
+        <w:rPr>
+          <w:lang w:val="en-US"/>
+        </w:rPr>
+        <w:t>None</w:t>
+      </w:r>
+    </w:p>
+    <w:p>
+      <w:pPr>
         <w:pStyle w:val="Heading2"/>
         <w:rPr>
           <w:b/>
@@ -3508,6 +3653,51 @@
     </w:p>
     <w:p>
       <w:pPr>
+        <w:rPr>
+          <w:lang w:val="en-US"/>
+        </w:rPr>
+      </w:pPr>
+      <w:r>
+        <w:rPr>
+          <w:lang w:val="en-US"/>
+        </w:rPr>
+        <w:t xml:space="preserve">Players will need to examine webpages for irregular </w:t>
+      </w:r>
+      <w:r>
+        <w:rPr>
+          <w:lang w:val="en-US"/>
+        </w:rPr>
+        <w:t>components and</w:t>
+      </w:r>
+      <w:r>
+        <w:rPr>
+          <w:lang w:val="en-US"/>
+        </w:rPr>
+        <w:t xml:space="preserve"> read </w:t>
+      </w:r>
+      <w:proofErr w:type="spellStart"/>
+      <w:r>
+        <w:rPr>
+          <w:lang w:val="en-US"/>
+        </w:rPr>
+        <w:t>though</w:t>
+      </w:r>
+      <w:proofErr w:type="spellEnd"/>
+      <w:r>
+        <w:rPr>
+          <w:lang w:val="en-US"/>
+        </w:rPr>
+        <w:t xml:space="preserve"> dialogue displayed to them for clues on how to proceed. </w:t>
+      </w:r>
+      <w:r>
+        <w:rPr>
+          <w:lang w:val="en-US"/>
+        </w:rPr>
+        <w:t xml:space="preserve"> There will also be components where the user will have to answer questions through a text field. </w:t>
+      </w:r>
+    </w:p>
+    <w:p>
+      <w:pPr>
         <w:pStyle w:val="Heading2"/>
         <w:rPr>
           <w:b/>
@@ -3527,6 +3717,11 @@
       <w:bookmarkEnd w:id="17"/>
     </w:p>
     <w:p>
+      <w:r>
+        <w:t xml:space="preserve">None. </w:t>
+      </w:r>
+    </w:p>
+    <w:p>
       <w:pPr>
         <w:pStyle w:val="Heading2"/>
         <w:rPr>
@@ -3555,6 +3750,11 @@
       </w:r>
     </w:p>
     <w:p>
+      <w:r>
+        <w:t xml:space="preserve">To proceed through the hidden pages, the user must solve the puzzle displayed on the screen. </w:t>
+      </w:r>
+    </w:p>
+    <w:p>
       <w:pPr>
         <w:pStyle w:val="Heading2"/>
         <w:rPr>
@@ -3579,34 +3779,6 @@
           <w:bCs/>
           <w:color w:val="auto"/>
         </w:rPr>
-        <w:t> </w:t>
-      </w:r>
-    </w:p>
-    <w:p>
-      <w:pPr>
-        <w:pStyle w:val="Heading2"/>
-        <w:rPr>
-          <w:b/>
-          <w:bCs/>
-          <w:color w:val="auto"/>
-        </w:rPr>
-      </w:pPr>
-      <w:bookmarkStart w:id="20" w:name="_Toc225930501"/>
-      <w:r>
-        <w:rPr>
-          <w:b/>
-          <w:bCs/>
-          <w:color w:val="auto"/>
-        </w:rPr>
-        <w:t>Difficulty and challenge</w:t>
-      </w:r>
-      <w:bookmarkEnd w:id="20"/>
-      <w:r>
-        <w:rPr>
-          <w:b/>
-          <w:bCs/>
-          <w:color w:val="auto"/>
-        </w:rPr>
         <w:t xml:space="preserve">  </w:t>
       </w:r>
     </w:p>
@@ -3616,6 +3788,12 @@
           <w:lang w:val="en-US"/>
         </w:rPr>
       </w:pPr>
+      <w:r>
+        <w:rPr>
+          <w:lang w:val="en-US"/>
+        </w:rPr>
+        <w:t xml:space="preserve">Puzzles will be broken up with dialogue to read.  </w:t>
+      </w:r>
     </w:p>
     <w:sectPr>
       <w:pgSz w:w="11906" w:h="16838"/>
@@ -3630,6 +3808,118 @@
 <file path=word/numbering.xml><?xml version="1.0" encoding="utf-8"?>
 <w:numbering xmlns:wpc="http://schemas.microsoft.com/office/word/2010/wordprocessingCanvas" xmlns:cx="http://schemas.microsoft.com/office/drawing/2014/chartex" xmlns:cx1="http://schemas.microsoft.com/office/drawing/2015/9/8/chartex" xmlns:cx2="http://schemas.microsoft.com/office/drawing/2015/10/21/chartex" xmlns:cx3="http://schemas.microsoft.com/office/drawing/2016/5/9/chartex" xmlns:cx4="http://schemas.microsoft.com/office/drawing/2016/5/10/chartex" xmlns:cx5="http://schemas.microsoft.com/office/drawing/2016/5/11/chartex" xmlns:cx6="http://schemas.microsoft.com/office/drawing/2016/5/12/chartex" xmlns:cx7="http://schemas.microsoft.com/office/drawing/2016/5/13/chartex" xmlns:cx8="http://schemas.microsoft.com/office/drawing/2016/5/14/chartex" xmlns:mc="http://schemas.openxmlformats.org/markup-compatibility/2006" xmlns:aink="http://schemas.microsoft.com/office/drawing/2016/ink" xmlns:am3d="http://schemas.microsoft.com/office/drawing/2017/model3d" xmlns:o="urn:schemas-microsoft-com:office:office" xmlns:oel="http://schemas.microsoft.com/office/2019/extlst" xmlns:r="http://schemas.openxmlformats.org/officeDocument/2006/relationships" xmlns:m="http://schemas.openxmlformats.org/officeDocument/2006/math" xmlns:v="urn:schemas-microsoft-com:vml" xmlns:wp14="http://schemas.microsoft.com/office/word/2010/wordprocessingDrawing" xmlns:wp="http://schemas.openxmlformats.org/drawingml/2006/wordprocessingDrawing" xmlns:w10="urn:schemas-microsoft-com:office:word" xmlns:w="http://schemas.openxmlformats.org/wordprocessingml/2006/main" xmlns:w14="http://schemas.microsoft.com/office/word/2010/wordml" xmlns:w15="http://schemas.microsoft.com/office/word/2012/wordml" xmlns:w16cex="http://schemas.microsoft.com/office/word/2018/wordml/cex" xmlns:w16cid="http://schemas.microsoft.com/office/word/2016/wordml/cid" xmlns:w16="http://schemas.microsoft.com/office/word/2018/wordml" xmlns:w16du="http://schemas.microsoft.com/office/word/2023/wordml/word16du" xmlns:w16sdtdh="http://schemas.microsoft.com/office/word/2020/wordml/sdtdatahash" xmlns:w16sdtfl="http://schemas.microsoft.com/office/word/2024/wordml/sdtformatlock" xmlns:w16se="http://schemas.microsoft.com/office/word/2015/wordml/symex" xmlns:wpg="http://schemas.microsoft.com/office/word/2010/wordprocessingGroup" xmlns:wpi="http://schemas.microsoft.com/office/word/2010/wordprocessingInk" xmlns:wne="http://schemas.microsoft.com/office/word/2006/wordml" xmlns:wps="http://schemas.microsoft.com/office/word/2010/wordprocessingShape" mc:Ignorable="w14 w15 w16se w16cid w16 w16cex w16sdtdh w16sdtfl w16du wp14">
   <w:abstractNum w:abstractNumId="0" w15:restartNumberingAfterBreak="0">
+    <w:nsid w:val="2C6D1619"/>
+    <w:multiLevelType w:val="hybridMultilevel"/>
+    <w:tmpl w:val="964A3EE8"/>
+    <w:lvl w:ilvl="0" w:tplc="5F7229F2">
+      <w:numFmt w:val="bullet"/>
+      <w:lvlText w:val=""/>
+      <w:lvlJc w:val="left"/>
+      <w:pPr>
+        <w:ind w:left="720" w:hanging="360"/>
+      </w:pPr>
+      <w:rPr>
+        <w:rFonts w:ascii="Symbol" w:eastAsiaTheme="minorHAnsi" w:hAnsi="Symbol" w:cstheme="minorBidi" w:hint="default"/>
+      </w:rPr>
+    </w:lvl>
+    <w:lvl w:ilvl="1" w:tplc="0C090003" w:tentative="1">
+      <w:start w:val="1"/>
+      <w:numFmt w:val="bullet"/>
+      <w:lvlText w:val="o"/>
+      <w:lvlJc w:val="left"/>
+      <w:pPr>
+        <w:ind w:left="1440" w:hanging="360"/>
+      </w:pPr>
+      <w:rPr>
+        <w:rFonts w:ascii="Courier New" w:hAnsi="Courier New" w:cs="Courier New" w:hint="default"/>
+      </w:rPr>
+    </w:lvl>
+    <w:lvl w:ilvl="2" w:tplc="0C090005" w:tentative="1">
+      <w:start w:val="1"/>
+      <w:numFmt w:val="bullet"/>
+      <w:lvlText w:val=""/>
+      <w:lvlJc w:val="left"/>
+      <w:pPr>
+        <w:ind w:left="2160" w:hanging="360"/>
+      </w:pPr>
+      <w:rPr>
+        <w:rFonts w:ascii="Wingdings" w:hAnsi="Wingdings" w:hint="default"/>
+      </w:rPr>
+    </w:lvl>
+    <w:lvl w:ilvl="3" w:tplc="0C090001" w:tentative="1">
+      <w:start w:val="1"/>
+      <w:numFmt w:val="bullet"/>
+      <w:lvlText w:val=""/>
+      <w:lvlJc w:val="left"/>
+      <w:pPr>
+        <w:ind w:left="2880" w:hanging="360"/>
+      </w:pPr>
+      <w:rPr>
+        <w:rFonts w:ascii="Symbol" w:hAnsi="Symbol" w:hint="default"/>
+      </w:rPr>
+    </w:lvl>
+    <w:lvl w:ilvl="4" w:tplc="0C090003" w:tentative="1">
+      <w:start w:val="1"/>
+      <w:numFmt w:val="bullet"/>
+      <w:lvlText w:val="o"/>
+      <w:lvlJc w:val="left"/>
+      <w:pPr>
+        <w:ind w:left="3600" w:hanging="360"/>
+      </w:pPr>
+      <w:rPr>
+        <w:rFonts w:ascii="Courier New" w:hAnsi="Courier New" w:cs="Courier New" w:hint="default"/>
+      </w:rPr>
+    </w:lvl>
+    <w:lvl w:ilvl="5" w:tplc="0C090005" w:tentative="1">
+      <w:start w:val="1"/>
+      <w:numFmt w:val="bullet"/>
+      <w:lvlText w:val=""/>
+      <w:lvlJc w:val="left"/>
+      <w:pPr>
+        <w:ind w:left="4320" w:hanging="360"/>
+      </w:pPr>
+      <w:rPr>
+        <w:rFonts w:ascii="Wingdings" w:hAnsi="Wingdings" w:hint="default"/>
+      </w:rPr>
+    </w:lvl>
+    <w:lvl w:ilvl="6" w:tplc="0C090001" w:tentative="1">
+      <w:start w:val="1"/>
+      <w:numFmt w:val="bullet"/>
+      <w:lvlText w:val=""/>
+      <w:lvlJc w:val="left"/>
+      <w:pPr>
+        <w:ind w:left="5040" w:hanging="360"/>
+      </w:pPr>
+      <w:rPr>
+        <w:rFonts w:ascii="Symbol" w:hAnsi="Symbol" w:hint="default"/>
+      </w:rPr>
+    </w:lvl>
+    <w:lvl w:ilvl="7" w:tplc="0C090003" w:tentative="1">
+      <w:start w:val="1"/>
+      <w:numFmt w:val="bullet"/>
+      <w:lvlText w:val="o"/>
+      <w:lvlJc w:val="left"/>
+      <w:pPr>
+        <w:ind w:left="5760" w:hanging="360"/>
+      </w:pPr>
+      <w:rPr>
+        <w:rFonts w:ascii="Courier New" w:hAnsi="Courier New" w:cs="Courier New" w:hint="default"/>
+      </w:rPr>
+    </w:lvl>
+    <w:lvl w:ilvl="8" w:tplc="0C090005" w:tentative="1">
+      <w:start w:val="1"/>
+      <w:numFmt w:val="bullet"/>
+      <w:lvlText w:val=""/>
+      <w:lvlJc w:val="left"/>
+      <w:pPr>
+        <w:ind w:left="6480" w:hanging="360"/>
+      </w:pPr>
+      <w:rPr>
+        <w:rFonts w:ascii="Wingdings" w:hAnsi="Wingdings" w:hint="default"/>
+      </w:rPr>
+    </w:lvl>
+  </w:abstractNum>
+  <w:abstractNum w:abstractNumId="1" w15:restartNumberingAfterBreak="0">
     <w:nsid w:val="6B295F11"/>
     <w:multiLevelType w:val="hybridMultilevel"/>
     <w:tmpl w:val="564C1654"/>
@@ -3742,6 +4032,9 @@
     </w:lvl>
   </w:abstractNum>
   <w:num w:numId="1" w16cid:durableId="753666516">
+    <w:abstractNumId w:val="1"/>
+  </w:num>
+  <w:num w:numId="2" w16cid:durableId="1706951120">
     <w:abstractNumId w:val="0"/>
   </w:num>
 </w:numbering>

</xml_diff>

<commit_message>
TASK-04: Set up a navigation system between the pages for the game
</commit_message>
<xml_diff>
--- a/docs/Game Design Document.docx
+++ b/docs/Game Design Document.docx
@@ -2138,21 +2138,7 @@
         <w:rPr>
           <w:lang w:val="en-US"/>
         </w:rPr>
-        <w:t xml:space="preserve">This will work </w:t>
-      </w:r>
-      <w:proofErr w:type="gramStart"/>
-      <w:r>
-        <w:rPr>
-          <w:lang w:val="en-US"/>
-        </w:rPr>
-        <w:t>as a way to</w:t>
-      </w:r>
-      <w:proofErr w:type="gramEnd"/>
-      <w:r>
-        <w:rPr>
-          <w:lang w:val="en-US"/>
-        </w:rPr>
-        <w:t xml:space="preserve"> practice my skills with </w:t>
+        <w:t xml:space="preserve">This will work as a way to practice my skills with </w:t>
       </w:r>
       <w:r>
         <w:rPr>
@@ -2580,21 +2566,7 @@
         <w:rPr>
           <w:lang w:val="en-US"/>
         </w:rPr>
-        <w:t xml:space="preserve">Unfamiliar with the product he is selling, </w:t>
-      </w:r>
-      <w:proofErr w:type="gramStart"/>
-      <w:r>
-        <w:rPr>
-          <w:lang w:val="en-US"/>
-        </w:rPr>
-        <w:t>doesn’t</w:t>
-      </w:r>
-      <w:proofErr w:type="gramEnd"/>
-      <w:r>
-        <w:rPr>
-          <w:lang w:val="en-US"/>
-        </w:rPr>
-        <w:t xml:space="preserve"> ask enough questions. </w:t>
+        <w:t xml:space="preserve">Unfamiliar with the product he is selling, doesn’t ask enough questions. </w:t>
       </w:r>
     </w:p>
     <w:p>
@@ -2681,35 +2653,7 @@
         <w:rPr>
           <w:lang w:val="en-US"/>
         </w:rPr>
-        <w:t xml:space="preserve">Expose the software as a virus and keep his </w:t>
-      </w:r>
-      <w:proofErr w:type="gramStart"/>
-      <w:r>
-        <w:rPr>
-          <w:lang w:val="en-US"/>
-        </w:rPr>
-        <w:t>job, or</w:t>
-      </w:r>
-      <w:proofErr w:type="gramEnd"/>
-      <w:r>
-        <w:rPr>
-          <w:lang w:val="en-US"/>
-        </w:rPr>
-        <w:t xml:space="preserve"> expose the software as a virus and </w:t>
-      </w:r>
-      <w:proofErr w:type="gramStart"/>
-      <w:r>
-        <w:rPr>
-          <w:lang w:val="en-US"/>
-        </w:rPr>
-        <w:t>loose</w:t>
-      </w:r>
-      <w:proofErr w:type="gramEnd"/>
-      <w:r>
-        <w:rPr>
-          <w:lang w:val="en-US"/>
-        </w:rPr>
-        <w:t xml:space="preserve"> his job. </w:t>
+        <w:t xml:space="preserve">Expose the software as a virus and keep his job, or expose the software as a virus and loose his job. </w:t>
       </w:r>
     </w:p>
     <w:p>
@@ -2870,21 +2814,7 @@
         <w:rPr>
           <w:lang w:val="en-US"/>
         </w:rPr>
-        <w:t xml:space="preserve">Trusting, caring, </w:t>
-      </w:r>
-      <w:proofErr w:type="gramStart"/>
-      <w:r>
-        <w:rPr>
-          <w:lang w:val="en-US"/>
-        </w:rPr>
-        <w:t>contributing member of</w:t>
-      </w:r>
-      <w:proofErr w:type="gramEnd"/>
-      <w:r>
-        <w:rPr>
-          <w:lang w:val="en-US"/>
-        </w:rPr>
-        <w:t xml:space="preserve"> the community. </w:t>
+        <w:t xml:space="preserve">Trusting, caring, contributing member of the community. </w:t>
       </w:r>
     </w:p>
     <w:p>
@@ -3194,21 +3124,7 @@
         <w:rPr>
           <w:lang w:val="en-US"/>
         </w:rPr>
-        <w:t xml:space="preserve">Unfamiliar with anti-virus </w:t>
-      </w:r>
-      <w:proofErr w:type="gramStart"/>
-      <w:r>
-        <w:rPr>
-          <w:lang w:val="en-US"/>
-        </w:rPr>
-        <w:t>software, and</w:t>
-      </w:r>
-      <w:proofErr w:type="gramEnd"/>
-      <w:r>
-        <w:rPr>
-          <w:lang w:val="en-US"/>
-        </w:rPr>
-        <w:t xml:space="preserve"> gets confused by technology. </w:t>
+        <w:t xml:space="preserve">Unfamiliar with anti-virus software, and gets confused by technology. </w:t>
       </w:r>
     </w:p>
     <w:p>
@@ -3368,7 +3284,6 @@
         <w:t xml:space="preserve">Instead, characters will be brought </w:t>
       </w:r>
       <w:proofErr w:type="spellStart"/>
-      <w:proofErr w:type="gramStart"/>
       <w:r>
         <w:rPr>
           <w:lang w:val="en-US"/>
@@ -3376,7 +3291,6 @@
         <w:t>too</w:t>
       </w:r>
       <w:proofErr w:type="spellEnd"/>
-      <w:proofErr w:type="gramEnd"/>
       <w:r>
         <w:rPr>
           <w:lang w:val="en-US"/>

</xml_diff>

<commit_message>
TASK-06: Crafted the riddle for Bills Challenge
</commit_message>
<xml_diff>
--- a/docs/Game Design Document.docx
+++ b/docs/Game Design Document.docx
@@ -2138,7 +2138,21 @@
         <w:rPr>
           <w:lang w:val="en-US"/>
         </w:rPr>
-        <w:t xml:space="preserve">This will work as a way to practice my skills with </w:t>
+        <w:t xml:space="preserve">This will work </w:t>
+      </w:r>
+      <w:proofErr w:type="gramStart"/>
+      <w:r>
+        <w:rPr>
+          <w:lang w:val="en-US"/>
+        </w:rPr>
+        <w:t>as a way to</w:t>
+      </w:r>
+      <w:proofErr w:type="gramEnd"/>
+      <w:r>
+        <w:rPr>
+          <w:lang w:val="en-US"/>
+        </w:rPr>
+        <w:t xml:space="preserve"> practice my skills with </w:t>
       </w:r>
       <w:r>
         <w:rPr>
@@ -2566,7 +2580,21 @@
         <w:rPr>
           <w:lang w:val="en-US"/>
         </w:rPr>
-        <w:t xml:space="preserve">Unfamiliar with the product he is selling, doesn’t ask enough questions. </w:t>
+        <w:t xml:space="preserve">Unfamiliar with the product he is selling, </w:t>
+      </w:r>
+      <w:proofErr w:type="gramStart"/>
+      <w:r>
+        <w:rPr>
+          <w:lang w:val="en-US"/>
+        </w:rPr>
+        <w:t>doesn’t</w:t>
+      </w:r>
+      <w:proofErr w:type="gramEnd"/>
+      <w:r>
+        <w:rPr>
+          <w:lang w:val="en-US"/>
+        </w:rPr>
+        <w:t xml:space="preserve"> ask enough questions. </w:t>
       </w:r>
     </w:p>
     <w:p>
@@ -2653,7 +2681,35 @@
         <w:rPr>
           <w:lang w:val="en-US"/>
         </w:rPr>
-        <w:t xml:space="preserve">Expose the software as a virus and keep his job, or expose the software as a virus and loose his job. </w:t>
+        <w:t xml:space="preserve">Expose the software as a virus and keep his </w:t>
+      </w:r>
+      <w:proofErr w:type="gramStart"/>
+      <w:r>
+        <w:rPr>
+          <w:lang w:val="en-US"/>
+        </w:rPr>
+        <w:t>job, or</w:t>
+      </w:r>
+      <w:proofErr w:type="gramEnd"/>
+      <w:r>
+        <w:rPr>
+          <w:lang w:val="en-US"/>
+        </w:rPr>
+        <w:t xml:space="preserve"> expose the software as a virus and </w:t>
+      </w:r>
+      <w:proofErr w:type="gramStart"/>
+      <w:r>
+        <w:rPr>
+          <w:lang w:val="en-US"/>
+        </w:rPr>
+        <w:t>loose</w:t>
+      </w:r>
+      <w:proofErr w:type="gramEnd"/>
+      <w:r>
+        <w:rPr>
+          <w:lang w:val="en-US"/>
+        </w:rPr>
+        <w:t xml:space="preserve"> his job. </w:t>
       </w:r>
     </w:p>
     <w:p>
@@ -2814,7 +2870,21 @@
         <w:rPr>
           <w:lang w:val="en-US"/>
         </w:rPr>
-        <w:t xml:space="preserve">Trusting, caring, contributing member of the community. </w:t>
+        <w:t xml:space="preserve">Trusting, caring, </w:t>
+      </w:r>
+      <w:proofErr w:type="gramStart"/>
+      <w:r>
+        <w:rPr>
+          <w:lang w:val="en-US"/>
+        </w:rPr>
+        <w:t>contributing member of</w:t>
+      </w:r>
+      <w:proofErr w:type="gramEnd"/>
+      <w:r>
+        <w:rPr>
+          <w:lang w:val="en-US"/>
+        </w:rPr>
+        <w:t xml:space="preserve"> the community. </w:t>
       </w:r>
     </w:p>
     <w:p>
@@ -3124,7 +3194,21 @@
         <w:rPr>
           <w:lang w:val="en-US"/>
         </w:rPr>
-        <w:t xml:space="preserve">Unfamiliar with anti-virus software, and gets confused by technology. </w:t>
+        <w:t xml:space="preserve">Unfamiliar with anti-virus </w:t>
+      </w:r>
+      <w:proofErr w:type="gramStart"/>
+      <w:r>
+        <w:rPr>
+          <w:lang w:val="en-US"/>
+        </w:rPr>
+        <w:t>software, and</w:t>
+      </w:r>
+      <w:proofErr w:type="gramEnd"/>
+      <w:r>
+        <w:rPr>
+          <w:lang w:val="en-US"/>
+        </w:rPr>
+        <w:t xml:space="preserve"> gets confused by technology. </w:t>
       </w:r>
     </w:p>
     <w:p>
@@ -3284,6 +3368,7 @@
         <w:t xml:space="preserve">Instead, characters will be brought </w:t>
       </w:r>
       <w:proofErr w:type="spellStart"/>
+      <w:proofErr w:type="gramStart"/>
       <w:r>
         <w:rPr>
           <w:lang w:val="en-US"/>
@@ -3291,6 +3376,7 @@
         <w:t>too</w:t>
       </w:r>
       <w:proofErr w:type="spellEnd"/>
+      <w:proofErr w:type="gramEnd"/>
       <w:r>
         <w:rPr>
           <w:lang w:val="en-US"/>
@@ -3612,6 +3698,423 @@
     </w:p>
     <w:p>
       <w:pPr>
+        <w:pStyle w:val="Heading3"/>
+        <w:rPr>
+          <w:b/>
+          <w:bCs/>
+          <w:color w:val="auto"/>
+          <w:sz w:val="24"/>
+          <w:szCs w:val="24"/>
+          <w:lang w:val="en-US"/>
+        </w:rPr>
+      </w:pPr>
+      <w:r>
+        <w:rPr>
+          <w:b/>
+          <w:bCs/>
+          <w:color w:val="auto"/>
+          <w:sz w:val="24"/>
+          <w:szCs w:val="24"/>
+          <w:lang w:val="en-US"/>
+        </w:rPr>
+        <w:t xml:space="preserve">Crafting Bills riddle: </w:t>
+      </w:r>
+    </w:p>
+    <w:p>
+      <w:pPr>
+        <w:rPr>
+          <w:lang w:val="en-US"/>
+        </w:rPr>
+      </w:pPr>
+      <w:r>
+        <w:rPr>
+          <w:lang w:val="en-US"/>
+        </w:rPr>
+        <w:t>On bills level, the player will need to solve the riddle using the dialogue of the call between Bill and John. I am following some steps from an AI Overview from google Gemini to help craft the riddle.</w:t>
+      </w:r>
+    </w:p>
+    <w:p>
+      <w:pPr>
+        <w:pStyle w:val="Heading4"/>
+        <w:rPr>
+          <w:b/>
+          <w:bCs/>
+          <w:color w:val="auto"/>
+          <w:u w:val="single"/>
+          <w:lang w:val="en-US"/>
+        </w:rPr>
+      </w:pPr>
+      <w:r>
+        <w:rPr>
+          <w:b/>
+          <w:bCs/>
+          <w:color w:val="auto"/>
+          <w:u w:val="single"/>
+          <w:lang w:val="en-US"/>
+        </w:rPr>
+        <w:t>Start with the answer:</w:t>
+      </w:r>
+    </w:p>
+    <w:p>
+      <w:pPr>
+        <w:rPr>
+          <w:lang w:val="en-US"/>
+        </w:rPr>
+      </w:pPr>
+      <w:r>
+        <w:rPr>
+          <w:lang w:val="en-US"/>
+        </w:rPr>
+        <w:t>The answer will be “safe”.</w:t>
+      </w:r>
+      <w:r>
+        <w:rPr>
+          <w:lang w:val="en-US"/>
+        </w:rPr>
+        <w:t xml:space="preserve"> The riddle will use characteristics of an actual safe to describe the item, and the hint will be that the world “safe” is in the dialogue of the conversation. It will be used as a guilt tactic by the programs developer because the big twist will be that the anti-virus software is not actually safe. </w:t>
+      </w:r>
+    </w:p>
+    <w:p>
+      <w:pPr>
+        <w:pStyle w:val="Heading4"/>
+        <w:rPr>
+          <w:u w:val="single"/>
+          <w:lang w:val="en-US"/>
+        </w:rPr>
+      </w:pPr>
+      <w:r>
+        <w:rPr>
+          <w:b/>
+          <w:bCs/>
+          <w:color w:val="auto"/>
+          <w:u w:val="single"/>
+          <w:lang w:val="en-US"/>
+        </w:rPr>
+        <w:t xml:space="preserve">Brainstorm Characteristics: </w:t>
+      </w:r>
+    </w:p>
+    <w:p>
+      <w:pPr>
+        <w:rPr>
+          <w:b/>
+          <w:bCs/>
+          <w:lang w:val="en-US"/>
+        </w:rPr>
+      </w:pPr>
+      <w:r>
+        <w:rPr>
+          <w:b/>
+          <w:bCs/>
+          <w:lang w:val="en-US"/>
+        </w:rPr>
+        <w:t xml:space="preserve">What does it look like? </w:t>
+      </w:r>
+      <w:r>
+        <w:rPr>
+          <w:lang w:val="en-US"/>
+        </w:rPr>
+        <w:t>Rectangle</w:t>
+      </w:r>
+      <w:r>
+        <w:rPr>
+          <w:lang w:val="en-US"/>
+        </w:rPr>
+        <w:t>, l</w:t>
+      </w:r>
+      <w:r>
+        <w:rPr>
+          <w:lang w:val="en-US"/>
+        </w:rPr>
+        <w:t>ock</w:t>
+      </w:r>
+      <w:r>
+        <w:rPr>
+          <w:lang w:val="en-US"/>
+        </w:rPr>
+        <w:t>, d</w:t>
+      </w:r>
+      <w:r>
+        <w:rPr>
+          <w:lang w:val="en-US"/>
+        </w:rPr>
+        <w:t>oor</w:t>
+      </w:r>
+      <w:r>
+        <w:rPr>
+          <w:lang w:val="en-US"/>
+        </w:rPr>
+        <w:t>, m</w:t>
+      </w:r>
+      <w:r>
+        <w:rPr>
+          <w:lang w:val="en-US"/>
+        </w:rPr>
+        <w:t>etal</w:t>
+      </w:r>
+      <w:r>
+        <w:rPr>
+          <w:lang w:val="en-US"/>
+        </w:rPr>
+        <w:t>.</w:t>
+      </w:r>
+    </w:p>
+    <w:p>
+      <w:pPr>
+        <w:rPr>
+          <w:lang w:val="en-US"/>
+        </w:rPr>
+      </w:pPr>
+      <w:r>
+        <w:rPr>
+          <w:b/>
+          <w:bCs/>
+          <w:lang w:val="en-US"/>
+        </w:rPr>
+        <w:t xml:space="preserve">What does it do? </w:t>
+      </w:r>
+      <w:r>
+        <w:rPr>
+          <w:lang w:val="en-US"/>
+        </w:rPr>
+        <w:t>Protects</w:t>
+      </w:r>
+      <w:r>
+        <w:rPr>
+          <w:lang w:val="en-US"/>
+        </w:rPr>
+        <w:t>, h</w:t>
+      </w:r>
+      <w:r>
+        <w:rPr>
+          <w:lang w:val="en-US"/>
+        </w:rPr>
+        <w:t>ides</w:t>
+      </w:r>
+      <w:r>
+        <w:rPr>
+          <w:lang w:val="en-US"/>
+        </w:rPr>
+        <w:t xml:space="preserve">, keeps items </w:t>
+      </w:r>
+      <w:proofErr w:type="gramStart"/>
+      <w:r>
+        <w:rPr>
+          <w:lang w:val="en-US"/>
+        </w:rPr>
+        <w:t>secured</w:t>
+      </w:r>
+      <w:proofErr w:type="gramEnd"/>
+      <w:r>
+        <w:rPr>
+          <w:lang w:val="en-US"/>
+        </w:rPr>
+        <w:t>.</w:t>
+      </w:r>
+      <w:r>
+        <w:rPr>
+          <w:lang w:val="en-US"/>
+        </w:rPr>
+        <w:t xml:space="preserve"> </w:t>
+      </w:r>
+    </w:p>
+    <w:p>
+      <w:pPr>
+        <w:rPr>
+          <w:lang w:val="en-US"/>
+        </w:rPr>
+      </w:pPr>
+      <w:r>
+        <w:rPr>
+          <w:b/>
+          <w:bCs/>
+          <w:lang w:val="en-US"/>
+        </w:rPr>
+        <w:t xml:space="preserve">Where do you find it? </w:t>
+      </w:r>
+      <w:r>
+        <w:rPr>
+          <w:lang w:val="en-US"/>
+        </w:rPr>
+        <w:t>Hotel</w:t>
+      </w:r>
+      <w:r>
+        <w:rPr>
+          <w:lang w:val="en-US"/>
+        </w:rPr>
+        <w:t xml:space="preserve"> room, bank.</w:t>
+      </w:r>
+    </w:p>
+    <w:p>
+      <w:pPr>
+        <w:pStyle w:val="Heading4"/>
+        <w:rPr>
+          <w:b/>
+          <w:bCs/>
+          <w:u w:val="single"/>
+          <w:lang w:val="en-US"/>
+        </w:rPr>
+      </w:pPr>
+      <w:r>
+        <w:rPr>
+          <w:b/>
+          <w:bCs/>
+          <w:color w:val="auto"/>
+          <w:u w:val="single"/>
+          <w:lang w:val="en-US"/>
+        </w:rPr>
+        <w:t xml:space="preserve">Use Metaphors and Personification: </w:t>
+      </w:r>
+    </w:p>
+    <w:p>
+      <w:pPr>
+        <w:rPr>
+          <w:lang w:val="en-US"/>
+        </w:rPr>
+      </w:pPr>
+      <w:r>
+        <w:rPr>
+          <w:b/>
+          <w:bCs/>
+          <w:lang w:val="en-US"/>
+        </w:rPr>
+        <w:t xml:space="preserve">Personification: </w:t>
+      </w:r>
+      <w:r>
+        <w:rPr>
+          <w:lang w:val="en-US"/>
+        </w:rPr>
+        <w:t xml:space="preserve">“I have a secure door but no rooms” </w:t>
+      </w:r>
+    </w:p>
+    <w:p>
+      <w:pPr>
+        <w:rPr>
+          <w:u w:val="single"/>
+          <w:lang w:val="en-US"/>
+        </w:rPr>
+      </w:pPr>
+      <w:r>
+        <w:rPr>
+          <w:b/>
+          <w:bCs/>
+          <w:lang w:val="en-US"/>
+        </w:rPr>
+        <w:t xml:space="preserve">Metaphor: </w:t>
+      </w:r>
+      <w:r>
+        <w:rPr>
+          <w:lang w:val="en-US"/>
+        </w:rPr>
+        <w:t xml:space="preserve">“I have </w:t>
+      </w:r>
+      <w:r>
+        <w:rPr>
+          <w:u w:val="single"/>
+          <w:lang w:val="en-US"/>
+        </w:rPr>
+        <w:t xml:space="preserve">a cold interior, but will keep your secrets safe” </w:t>
+      </w:r>
+    </w:p>
+    <w:p>
+      <w:pPr>
+        <w:pStyle w:val="Heading4"/>
+        <w:rPr>
+          <w:b/>
+          <w:bCs/>
+          <w:color w:val="auto"/>
+          <w:u w:val="single"/>
+          <w:lang w:val="en-US"/>
+        </w:rPr>
+      </w:pPr>
+      <w:r>
+        <w:rPr>
+          <w:b/>
+          <w:bCs/>
+          <w:color w:val="auto"/>
+          <w:u w:val="single"/>
+          <w:lang w:val="en-US"/>
+        </w:rPr>
+        <w:t xml:space="preserve">Craft the Clues (Drafting): </w:t>
+      </w:r>
+    </w:p>
+    <w:p>
+      <w:pPr>
+        <w:rPr>
+          <w:i/>
+          <w:iCs/>
+          <w:lang w:val="en-US"/>
+        </w:rPr>
+      </w:pPr>
+      <w:r>
+        <w:rPr>
+          <w:i/>
+          <w:iCs/>
+          <w:lang w:val="en-US"/>
+        </w:rPr>
+        <w:t>My rectangular interior is dark and cold</w:t>
+      </w:r>
+    </w:p>
+    <w:p>
+      <w:pPr>
+        <w:rPr>
+          <w:i/>
+          <w:iCs/>
+          <w:lang w:val="en-US"/>
+        </w:rPr>
+      </w:pPr>
+      <w:r>
+        <w:rPr>
+          <w:i/>
+          <w:iCs/>
+          <w:lang w:val="en-US"/>
+        </w:rPr>
+        <w:t>Secrets of yours, I will</w:t>
+      </w:r>
+      <w:r>
+        <w:rPr>
+          <w:i/>
+          <w:iCs/>
+          <w:lang w:val="en-US"/>
+        </w:rPr>
+        <w:t xml:space="preserve"> hold</w:t>
+      </w:r>
+    </w:p>
+    <w:p>
+      <w:pPr>
+        <w:rPr>
+          <w:i/>
+          <w:iCs/>
+          <w:lang w:val="en-US"/>
+        </w:rPr>
+      </w:pPr>
+      <w:r>
+        <w:rPr>
+          <w:i/>
+          <w:iCs/>
+          <w:lang w:val="en-US"/>
+        </w:rPr>
+        <w:t>A simple code protects all</w:t>
+      </w:r>
+    </w:p>
+    <w:p>
+      <w:pPr>
+        <w:rPr>
+          <w:i/>
+          <w:iCs/>
+          <w:lang w:val="en-US"/>
+        </w:rPr>
+      </w:pPr>
+      <w:r>
+        <w:rPr>
+          <w:i/>
+          <w:iCs/>
+          <w:lang w:val="en-US"/>
+        </w:rPr>
+        <w:t xml:space="preserve">What am I? </w:t>
+      </w:r>
+    </w:p>
+    <w:p>
+      <w:pPr>
         <w:pStyle w:val="Heading2"/>
         <w:rPr>
           <w:b/>
@@ -3620,6 +4123,16 @@
         </w:rPr>
       </w:pPr>
       <w:bookmarkStart w:id="17" w:name="_Toc225930497"/>
+    </w:p>
+    <w:p>
+      <w:pPr>
+        <w:pStyle w:val="Heading2"/>
+        <w:rPr>
+          <w:b/>
+          <w:bCs/>
+          <w:color w:val="auto"/>
+        </w:rPr>
+      </w:pPr>
       <w:r>
         <w:rPr>
           <w:b/>
@@ -3722,6 +4235,95 @@
 <file path=word/numbering.xml><?xml version="1.0" encoding="utf-8"?>
 <w:numbering xmlns:wpc="http://schemas.microsoft.com/office/word/2010/wordprocessingCanvas" xmlns:cx="http://schemas.microsoft.com/office/drawing/2014/chartex" xmlns:cx1="http://schemas.microsoft.com/office/drawing/2015/9/8/chartex" xmlns:cx2="http://schemas.microsoft.com/office/drawing/2015/10/21/chartex" xmlns:cx3="http://schemas.microsoft.com/office/drawing/2016/5/9/chartex" xmlns:cx4="http://schemas.microsoft.com/office/drawing/2016/5/10/chartex" xmlns:cx5="http://schemas.microsoft.com/office/drawing/2016/5/11/chartex" xmlns:cx6="http://schemas.microsoft.com/office/drawing/2016/5/12/chartex" xmlns:cx7="http://schemas.microsoft.com/office/drawing/2016/5/13/chartex" xmlns:cx8="http://schemas.microsoft.com/office/drawing/2016/5/14/chartex" xmlns:mc="http://schemas.openxmlformats.org/markup-compatibility/2006" xmlns:aink="http://schemas.microsoft.com/office/drawing/2016/ink" xmlns:am3d="http://schemas.microsoft.com/office/drawing/2017/model3d" xmlns:o="urn:schemas-microsoft-com:office:office" xmlns:oel="http://schemas.microsoft.com/office/2019/extlst" xmlns:r="http://schemas.openxmlformats.org/officeDocument/2006/relationships" xmlns:m="http://schemas.openxmlformats.org/officeDocument/2006/math" xmlns:v="urn:schemas-microsoft-com:vml" xmlns:wp14="http://schemas.microsoft.com/office/word/2010/wordprocessingDrawing" xmlns:wp="http://schemas.openxmlformats.org/drawingml/2006/wordprocessingDrawing" xmlns:w10="urn:schemas-microsoft-com:office:word" xmlns:w="http://schemas.openxmlformats.org/wordprocessingml/2006/main" xmlns:w14="http://schemas.microsoft.com/office/word/2010/wordml" xmlns:w15="http://schemas.microsoft.com/office/word/2012/wordml" xmlns:w16cex="http://schemas.microsoft.com/office/word/2018/wordml/cex" xmlns:w16cid="http://schemas.microsoft.com/office/word/2016/wordml/cid" xmlns:w16="http://schemas.microsoft.com/office/word/2018/wordml" xmlns:w16du="http://schemas.microsoft.com/office/word/2023/wordml/word16du" xmlns:w16sdtdh="http://schemas.microsoft.com/office/word/2020/wordml/sdtdatahash" xmlns:w16sdtfl="http://schemas.microsoft.com/office/word/2024/wordml/sdtformatlock" xmlns:w16se="http://schemas.microsoft.com/office/word/2015/wordml/symex" xmlns:wpg="http://schemas.microsoft.com/office/word/2010/wordprocessingGroup" xmlns:wpi="http://schemas.microsoft.com/office/word/2010/wordprocessingInk" xmlns:wne="http://schemas.microsoft.com/office/word/2006/wordml" xmlns:wps="http://schemas.microsoft.com/office/word/2010/wordprocessingShape" mc:Ignorable="w14 w15 w16se w16cid w16 w16cex w16sdtdh w16sdtfl w16du wp14">
   <w:abstractNum w:abstractNumId="0" w15:restartNumberingAfterBreak="0">
+    <w:nsid w:val="0A552250"/>
+    <w:multiLevelType w:val="hybridMultilevel"/>
+    <w:tmpl w:val="2F6828DE"/>
+    <w:lvl w:ilvl="0" w:tplc="0C09000F">
+      <w:start w:val="1"/>
+      <w:numFmt w:val="decimal"/>
+      <w:lvlText w:val="%1."/>
+      <w:lvlJc w:val="left"/>
+      <w:pPr>
+        <w:ind w:left="720" w:hanging="360"/>
+      </w:pPr>
+      <w:rPr>
+        <w:rFonts w:hint="default"/>
+      </w:rPr>
+    </w:lvl>
+    <w:lvl w:ilvl="1" w:tplc="0C090019" w:tentative="1">
+      <w:start w:val="1"/>
+      <w:numFmt w:val="lowerLetter"/>
+      <w:lvlText w:val="%2."/>
+      <w:lvlJc w:val="left"/>
+      <w:pPr>
+        <w:ind w:left="1440" w:hanging="360"/>
+      </w:pPr>
+    </w:lvl>
+    <w:lvl w:ilvl="2" w:tplc="0C09001B" w:tentative="1">
+      <w:start w:val="1"/>
+      <w:numFmt w:val="lowerRoman"/>
+      <w:lvlText w:val="%3."/>
+      <w:lvlJc w:val="right"/>
+      <w:pPr>
+        <w:ind w:left="2160" w:hanging="180"/>
+      </w:pPr>
+    </w:lvl>
+    <w:lvl w:ilvl="3" w:tplc="0C09000F" w:tentative="1">
+      <w:start w:val="1"/>
+      <w:numFmt w:val="decimal"/>
+      <w:lvlText w:val="%4."/>
+      <w:lvlJc w:val="left"/>
+      <w:pPr>
+        <w:ind w:left="2880" w:hanging="360"/>
+      </w:pPr>
+    </w:lvl>
+    <w:lvl w:ilvl="4" w:tplc="0C090019" w:tentative="1">
+      <w:start w:val="1"/>
+      <w:numFmt w:val="lowerLetter"/>
+      <w:lvlText w:val="%5."/>
+      <w:lvlJc w:val="left"/>
+      <w:pPr>
+        <w:ind w:left="3600" w:hanging="360"/>
+      </w:pPr>
+    </w:lvl>
+    <w:lvl w:ilvl="5" w:tplc="0C09001B" w:tentative="1">
+      <w:start w:val="1"/>
+      <w:numFmt w:val="lowerRoman"/>
+      <w:lvlText w:val="%6."/>
+      <w:lvlJc w:val="right"/>
+      <w:pPr>
+        <w:ind w:left="4320" w:hanging="180"/>
+      </w:pPr>
+    </w:lvl>
+    <w:lvl w:ilvl="6" w:tplc="0C09000F" w:tentative="1">
+      <w:start w:val="1"/>
+      <w:numFmt w:val="decimal"/>
+      <w:lvlText w:val="%7."/>
+      <w:lvlJc w:val="left"/>
+      <w:pPr>
+        <w:ind w:left="5040" w:hanging="360"/>
+      </w:pPr>
+    </w:lvl>
+    <w:lvl w:ilvl="7" w:tplc="0C090019" w:tentative="1">
+      <w:start w:val="1"/>
+      <w:numFmt w:val="lowerLetter"/>
+      <w:lvlText w:val="%8."/>
+      <w:lvlJc w:val="left"/>
+      <w:pPr>
+        <w:ind w:left="5760" w:hanging="360"/>
+      </w:pPr>
+    </w:lvl>
+    <w:lvl w:ilvl="8" w:tplc="0C09001B" w:tentative="1">
+      <w:start w:val="1"/>
+      <w:numFmt w:val="lowerRoman"/>
+      <w:lvlText w:val="%9."/>
+      <w:lvlJc w:val="right"/>
+      <w:pPr>
+        <w:ind w:left="6480" w:hanging="180"/>
+      </w:pPr>
+    </w:lvl>
+  </w:abstractNum>
+  <w:abstractNum w:abstractNumId="1" w15:restartNumberingAfterBreak="0">
     <w:nsid w:val="2C6D1619"/>
     <w:multiLevelType w:val="hybridMultilevel"/>
     <w:tmpl w:val="964A3EE8"/>
@@ -3833,7 +4435,120 @@
       </w:rPr>
     </w:lvl>
   </w:abstractNum>
-  <w:abstractNum w:abstractNumId="1" w15:restartNumberingAfterBreak="0">
+  <w:abstractNum w:abstractNumId="2" w15:restartNumberingAfterBreak="0">
+    <w:nsid w:val="39553707"/>
+    <w:multiLevelType w:val="hybridMultilevel"/>
+    <w:tmpl w:val="461C12AA"/>
+    <w:lvl w:ilvl="0" w:tplc="7F40256E">
+      <w:start w:val="1"/>
+      <w:numFmt w:val="bullet"/>
+      <w:lvlText w:val=""/>
+      <w:lvlJc w:val="left"/>
+      <w:pPr>
+        <w:ind w:left="720" w:hanging="360"/>
+      </w:pPr>
+      <w:rPr>
+        <w:rFonts w:ascii="Symbol" w:eastAsiaTheme="minorHAnsi" w:hAnsi="Symbol" w:cstheme="minorBidi" w:hint="default"/>
+      </w:rPr>
+    </w:lvl>
+    <w:lvl w:ilvl="1" w:tplc="0C090003" w:tentative="1">
+      <w:start w:val="1"/>
+      <w:numFmt w:val="bullet"/>
+      <w:lvlText w:val="o"/>
+      <w:lvlJc w:val="left"/>
+      <w:pPr>
+        <w:ind w:left="1440" w:hanging="360"/>
+      </w:pPr>
+      <w:rPr>
+        <w:rFonts w:ascii="Courier New" w:hAnsi="Courier New" w:cs="Courier New" w:hint="default"/>
+      </w:rPr>
+    </w:lvl>
+    <w:lvl w:ilvl="2" w:tplc="0C090005" w:tentative="1">
+      <w:start w:val="1"/>
+      <w:numFmt w:val="bullet"/>
+      <w:lvlText w:val=""/>
+      <w:lvlJc w:val="left"/>
+      <w:pPr>
+        <w:ind w:left="2160" w:hanging="360"/>
+      </w:pPr>
+      <w:rPr>
+        <w:rFonts w:ascii="Wingdings" w:hAnsi="Wingdings" w:hint="default"/>
+      </w:rPr>
+    </w:lvl>
+    <w:lvl w:ilvl="3" w:tplc="0C090001" w:tentative="1">
+      <w:start w:val="1"/>
+      <w:numFmt w:val="bullet"/>
+      <w:lvlText w:val=""/>
+      <w:lvlJc w:val="left"/>
+      <w:pPr>
+        <w:ind w:left="2880" w:hanging="360"/>
+      </w:pPr>
+      <w:rPr>
+        <w:rFonts w:ascii="Symbol" w:hAnsi="Symbol" w:hint="default"/>
+      </w:rPr>
+    </w:lvl>
+    <w:lvl w:ilvl="4" w:tplc="0C090003" w:tentative="1">
+      <w:start w:val="1"/>
+      <w:numFmt w:val="bullet"/>
+      <w:lvlText w:val="o"/>
+      <w:lvlJc w:val="left"/>
+      <w:pPr>
+        <w:ind w:left="3600" w:hanging="360"/>
+      </w:pPr>
+      <w:rPr>
+        <w:rFonts w:ascii="Courier New" w:hAnsi="Courier New" w:cs="Courier New" w:hint="default"/>
+      </w:rPr>
+    </w:lvl>
+    <w:lvl w:ilvl="5" w:tplc="0C090005" w:tentative="1">
+      <w:start w:val="1"/>
+      <w:numFmt w:val="bullet"/>
+      <w:lvlText w:val=""/>
+      <w:lvlJc w:val="left"/>
+      <w:pPr>
+        <w:ind w:left="4320" w:hanging="360"/>
+      </w:pPr>
+      <w:rPr>
+        <w:rFonts w:ascii="Wingdings" w:hAnsi="Wingdings" w:hint="default"/>
+      </w:rPr>
+    </w:lvl>
+    <w:lvl w:ilvl="6" w:tplc="0C090001" w:tentative="1">
+      <w:start w:val="1"/>
+      <w:numFmt w:val="bullet"/>
+      <w:lvlText w:val=""/>
+      <w:lvlJc w:val="left"/>
+      <w:pPr>
+        <w:ind w:left="5040" w:hanging="360"/>
+      </w:pPr>
+      <w:rPr>
+        <w:rFonts w:ascii="Symbol" w:hAnsi="Symbol" w:hint="default"/>
+      </w:rPr>
+    </w:lvl>
+    <w:lvl w:ilvl="7" w:tplc="0C090003" w:tentative="1">
+      <w:start w:val="1"/>
+      <w:numFmt w:val="bullet"/>
+      <w:lvlText w:val="o"/>
+      <w:lvlJc w:val="left"/>
+      <w:pPr>
+        <w:ind w:left="5760" w:hanging="360"/>
+      </w:pPr>
+      <w:rPr>
+        <w:rFonts w:ascii="Courier New" w:hAnsi="Courier New" w:cs="Courier New" w:hint="default"/>
+      </w:rPr>
+    </w:lvl>
+    <w:lvl w:ilvl="8" w:tplc="0C090005" w:tentative="1">
+      <w:start w:val="1"/>
+      <w:numFmt w:val="bullet"/>
+      <w:lvlText w:val=""/>
+      <w:lvlJc w:val="left"/>
+      <w:pPr>
+        <w:ind w:left="6480" w:hanging="360"/>
+      </w:pPr>
+      <w:rPr>
+        <w:rFonts w:ascii="Wingdings" w:hAnsi="Wingdings" w:hint="default"/>
+      </w:rPr>
+    </w:lvl>
+  </w:abstractNum>
+  <w:abstractNum w:abstractNumId="3" w15:restartNumberingAfterBreak="0">
     <w:nsid w:val="6B295F11"/>
     <w:multiLevelType w:val="hybridMultilevel"/>
     <w:tmpl w:val="564C1654"/>
@@ -3945,11 +4660,133 @@
       </w:rPr>
     </w:lvl>
   </w:abstractNum>
+  <w:abstractNum w:abstractNumId="4" w15:restartNumberingAfterBreak="0">
+    <w:nsid w:val="71A47FEF"/>
+    <w:multiLevelType w:val="hybridMultilevel"/>
+    <w:tmpl w:val="D5A83772"/>
+    <w:lvl w:ilvl="0" w:tplc="548C0338">
+      <w:start w:val="1"/>
+      <w:numFmt w:val="bullet"/>
+      <w:lvlText w:val=""/>
+      <w:lvlJc w:val="left"/>
+      <w:pPr>
+        <w:ind w:left="720" w:hanging="360"/>
+      </w:pPr>
+      <w:rPr>
+        <w:rFonts w:ascii="Symbol" w:eastAsiaTheme="minorHAnsi" w:hAnsi="Symbol" w:cstheme="minorBidi" w:hint="default"/>
+      </w:rPr>
+    </w:lvl>
+    <w:lvl w:ilvl="1" w:tplc="0C090003" w:tentative="1">
+      <w:start w:val="1"/>
+      <w:numFmt w:val="bullet"/>
+      <w:lvlText w:val="o"/>
+      <w:lvlJc w:val="left"/>
+      <w:pPr>
+        <w:ind w:left="1440" w:hanging="360"/>
+      </w:pPr>
+      <w:rPr>
+        <w:rFonts w:ascii="Courier New" w:hAnsi="Courier New" w:cs="Courier New" w:hint="default"/>
+      </w:rPr>
+    </w:lvl>
+    <w:lvl w:ilvl="2" w:tplc="0C090005" w:tentative="1">
+      <w:start w:val="1"/>
+      <w:numFmt w:val="bullet"/>
+      <w:lvlText w:val=""/>
+      <w:lvlJc w:val="left"/>
+      <w:pPr>
+        <w:ind w:left="2160" w:hanging="360"/>
+      </w:pPr>
+      <w:rPr>
+        <w:rFonts w:ascii="Wingdings" w:hAnsi="Wingdings" w:hint="default"/>
+      </w:rPr>
+    </w:lvl>
+    <w:lvl w:ilvl="3" w:tplc="0C090001" w:tentative="1">
+      <w:start w:val="1"/>
+      <w:numFmt w:val="bullet"/>
+      <w:lvlText w:val=""/>
+      <w:lvlJc w:val="left"/>
+      <w:pPr>
+        <w:ind w:left="2880" w:hanging="360"/>
+      </w:pPr>
+      <w:rPr>
+        <w:rFonts w:ascii="Symbol" w:hAnsi="Symbol" w:hint="default"/>
+      </w:rPr>
+    </w:lvl>
+    <w:lvl w:ilvl="4" w:tplc="0C090003" w:tentative="1">
+      <w:start w:val="1"/>
+      <w:numFmt w:val="bullet"/>
+      <w:lvlText w:val="o"/>
+      <w:lvlJc w:val="left"/>
+      <w:pPr>
+        <w:ind w:left="3600" w:hanging="360"/>
+      </w:pPr>
+      <w:rPr>
+        <w:rFonts w:ascii="Courier New" w:hAnsi="Courier New" w:cs="Courier New" w:hint="default"/>
+      </w:rPr>
+    </w:lvl>
+    <w:lvl w:ilvl="5" w:tplc="0C090005" w:tentative="1">
+      <w:start w:val="1"/>
+      <w:numFmt w:val="bullet"/>
+      <w:lvlText w:val=""/>
+      <w:lvlJc w:val="left"/>
+      <w:pPr>
+        <w:ind w:left="4320" w:hanging="360"/>
+      </w:pPr>
+      <w:rPr>
+        <w:rFonts w:ascii="Wingdings" w:hAnsi="Wingdings" w:hint="default"/>
+      </w:rPr>
+    </w:lvl>
+    <w:lvl w:ilvl="6" w:tplc="0C090001" w:tentative="1">
+      <w:start w:val="1"/>
+      <w:numFmt w:val="bullet"/>
+      <w:lvlText w:val=""/>
+      <w:lvlJc w:val="left"/>
+      <w:pPr>
+        <w:ind w:left="5040" w:hanging="360"/>
+      </w:pPr>
+      <w:rPr>
+        <w:rFonts w:ascii="Symbol" w:hAnsi="Symbol" w:hint="default"/>
+      </w:rPr>
+    </w:lvl>
+    <w:lvl w:ilvl="7" w:tplc="0C090003" w:tentative="1">
+      <w:start w:val="1"/>
+      <w:numFmt w:val="bullet"/>
+      <w:lvlText w:val="o"/>
+      <w:lvlJc w:val="left"/>
+      <w:pPr>
+        <w:ind w:left="5760" w:hanging="360"/>
+      </w:pPr>
+      <w:rPr>
+        <w:rFonts w:ascii="Courier New" w:hAnsi="Courier New" w:cs="Courier New" w:hint="default"/>
+      </w:rPr>
+    </w:lvl>
+    <w:lvl w:ilvl="8" w:tplc="0C090005" w:tentative="1">
+      <w:start w:val="1"/>
+      <w:numFmt w:val="bullet"/>
+      <w:lvlText w:val=""/>
+      <w:lvlJc w:val="left"/>
+      <w:pPr>
+        <w:ind w:left="6480" w:hanging="360"/>
+      </w:pPr>
+      <w:rPr>
+        <w:rFonts w:ascii="Wingdings" w:hAnsi="Wingdings" w:hint="default"/>
+      </w:rPr>
+    </w:lvl>
+  </w:abstractNum>
   <w:num w:numId="1" w16cid:durableId="753666516">
+    <w:abstractNumId w:val="3"/>
+  </w:num>
+  <w:num w:numId="2" w16cid:durableId="1706951120">
     <w:abstractNumId w:val="1"/>
   </w:num>
-  <w:num w:numId="2" w16cid:durableId="1706951120">
+  <w:num w:numId="3" w16cid:durableId="665059364">
     <w:abstractNumId w:val="0"/>
+  </w:num>
+  <w:num w:numId="4" w16cid:durableId="1380936175">
+    <w:abstractNumId w:val="2"/>
+  </w:num>
+  <w:num w:numId="5" w16cid:durableId="942497355">
+    <w:abstractNumId w:val="4"/>
   </w:num>
 </w:numbering>
 </file>
@@ -4424,7 +5261,6 @@
     <w:next w:val="Normal"/>
     <w:link w:val="Heading4Char"/>
     <w:uiPriority w:val="9"/>
-    <w:semiHidden/>
     <w:unhideWhenUsed/>
     <w:qFormat/>
     <w:rsid w:val="00FD2DB4"/>
@@ -4621,7 +5457,6 @@
     <w:basedOn w:val="DefaultParagraphFont"/>
     <w:link w:val="Heading4"/>
     <w:uiPriority w:val="9"/>
-    <w:semiHidden/>
     <w:rsid w:val="00FD2DB4"/>
     <w:rPr>
       <w:rFonts w:eastAsiaTheme="majorEastAsia" w:cstheme="majorBidi"/>

</xml_diff>

<commit_message>
TASK-08: Added Johns Pattern matching puzzle to the game design documentation
</commit_message>
<xml_diff>
--- a/docs/Game Design Document.docx
+++ b/docs/Game Design Document.docx
@@ -2138,21 +2138,7 @@
         <w:rPr>
           <w:lang w:val="en-US"/>
         </w:rPr>
-        <w:t xml:space="preserve">This will work </w:t>
-      </w:r>
-      <w:proofErr w:type="gramStart"/>
-      <w:r>
-        <w:rPr>
-          <w:lang w:val="en-US"/>
-        </w:rPr>
-        <w:t>as a way to</w:t>
-      </w:r>
-      <w:proofErr w:type="gramEnd"/>
-      <w:r>
-        <w:rPr>
-          <w:lang w:val="en-US"/>
-        </w:rPr>
-        <w:t xml:space="preserve"> practice my skills with </w:t>
+        <w:t xml:space="preserve">This will work as a way to practice my skills with </w:t>
       </w:r>
       <w:r>
         <w:rPr>
@@ -2580,21 +2566,7 @@
         <w:rPr>
           <w:lang w:val="en-US"/>
         </w:rPr>
-        <w:t xml:space="preserve">Unfamiliar with the product he is selling, </w:t>
-      </w:r>
-      <w:proofErr w:type="gramStart"/>
-      <w:r>
-        <w:rPr>
-          <w:lang w:val="en-US"/>
-        </w:rPr>
-        <w:t>doesn’t</w:t>
-      </w:r>
-      <w:proofErr w:type="gramEnd"/>
-      <w:r>
-        <w:rPr>
-          <w:lang w:val="en-US"/>
-        </w:rPr>
-        <w:t xml:space="preserve"> ask enough questions. </w:t>
+        <w:t xml:space="preserve">Unfamiliar with the product he is selling, doesn’t ask enough questions. </w:t>
       </w:r>
     </w:p>
     <w:p>
@@ -2681,35 +2653,7 @@
         <w:rPr>
           <w:lang w:val="en-US"/>
         </w:rPr>
-        <w:t xml:space="preserve">Expose the software as a virus and keep his </w:t>
-      </w:r>
-      <w:proofErr w:type="gramStart"/>
-      <w:r>
-        <w:rPr>
-          <w:lang w:val="en-US"/>
-        </w:rPr>
-        <w:t>job, or</w:t>
-      </w:r>
-      <w:proofErr w:type="gramEnd"/>
-      <w:r>
-        <w:rPr>
-          <w:lang w:val="en-US"/>
-        </w:rPr>
-        <w:t xml:space="preserve"> expose the software as a virus and </w:t>
-      </w:r>
-      <w:proofErr w:type="gramStart"/>
-      <w:r>
-        <w:rPr>
-          <w:lang w:val="en-US"/>
-        </w:rPr>
-        <w:t>loose</w:t>
-      </w:r>
-      <w:proofErr w:type="gramEnd"/>
-      <w:r>
-        <w:rPr>
-          <w:lang w:val="en-US"/>
-        </w:rPr>
-        <w:t xml:space="preserve"> his job. </w:t>
+        <w:t xml:space="preserve">Expose the software as a virus and keep his job, or expose the software as a virus and loose his job. </w:t>
       </w:r>
     </w:p>
     <w:p>
@@ -2870,21 +2814,7 @@
         <w:rPr>
           <w:lang w:val="en-US"/>
         </w:rPr>
-        <w:t xml:space="preserve">Trusting, caring, </w:t>
-      </w:r>
-      <w:proofErr w:type="gramStart"/>
-      <w:r>
-        <w:rPr>
-          <w:lang w:val="en-US"/>
-        </w:rPr>
-        <w:t>contributing member of</w:t>
-      </w:r>
-      <w:proofErr w:type="gramEnd"/>
-      <w:r>
-        <w:rPr>
-          <w:lang w:val="en-US"/>
-        </w:rPr>
-        <w:t xml:space="preserve"> the community. </w:t>
+        <w:t xml:space="preserve">Trusting, caring, contributing member of the community. </w:t>
       </w:r>
     </w:p>
     <w:p>
@@ -3194,21 +3124,7 @@
         <w:rPr>
           <w:lang w:val="en-US"/>
         </w:rPr>
-        <w:t xml:space="preserve">Unfamiliar with anti-virus </w:t>
-      </w:r>
-      <w:proofErr w:type="gramStart"/>
-      <w:r>
-        <w:rPr>
-          <w:lang w:val="en-US"/>
-        </w:rPr>
-        <w:t>software, and</w:t>
-      </w:r>
-      <w:proofErr w:type="gramEnd"/>
-      <w:r>
-        <w:rPr>
-          <w:lang w:val="en-US"/>
-        </w:rPr>
-        <w:t xml:space="preserve"> gets confused by technology. </w:t>
+        <w:t xml:space="preserve">Unfamiliar with anti-virus software, and gets confused by technology. </w:t>
       </w:r>
     </w:p>
     <w:p>
@@ -3368,7 +3284,6 @@
         <w:t xml:space="preserve">Instead, characters will be brought </w:t>
       </w:r>
       <w:proofErr w:type="spellStart"/>
-      <w:proofErr w:type="gramStart"/>
       <w:r>
         <w:rPr>
           <w:lang w:val="en-US"/>
@@ -3376,7 +3291,6 @@
         <w:t>too</w:t>
       </w:r>
       <w:proofErr w:type="spellEnd"/>
-      <w:proofErr w:type="gramEnd"/>
       <w:r>
         <w:rPr>
           <w:lang w:val="en-US"/>
@@ -3765,13 +3679,7 @@
         <w:rPr>
           <w:lang w:val="en-US"/>
         </w:rPr>
-        <w:t>The answer will be “safe”.</w:t>
-      </w:r>
-      <w:r>
-        <w:rPr>
-          <w:lang w:val="en-US"/>
-        </w:rPr>
-        <w:t xml:space="preserve"> The riddle will use characteristics of an actual safe to describe the item, and the hint will be that the world “safe” is in the dialogue of the conversation. It will be used as a guilt tactic by the programs developer because the big twist will be that the anti-virus software is not actually safe. </w:t>
+        <w:t xml:space="preserve">The answer will be “safe”. The riddle will use characteristics of an actual safe to describe the item, and the hint will be that the world “safe” is in the dialogue of the conversation. It will be used as a guilt tactic by the programs developer because the big twist will be that the anti-virus software is not actually safe. </w:t>
       </w:r>
     </w:p>
     <w:p>
@@ -3894,21 +3802,7 @@
         <w:rPr>
           <w:lang w:val="en-US"/>
         </w:rPr>
-        <w:t xml:space="preserve">, keeps items </w:t>
-      </w:r>
-      <w:proofErr w:type="gramStart"/>
-      <w:r>
-        <w:rPr>
-          <w:lang w:val="en-US"/>
-        </w:rPr>
-        <w:t>secured</w:t>
-      </w:r>
-      <w:proofErr w:type="gramEnd"/>
-      <w:r>
-        <w:rPr>
-          <w:lang w:val="en-US"/>
-        </w:rPr>
-        <w:t>.</w:t>
+        <w:t>, keeps items secured.</w:t>
       </w:r>
       <w:r>
         <w:rPr>
@@ -4112,6 +4006,103 @@
         </w:rPr>
         <w:t xml:space="preserve">What am I? </w:t>
       </w:r>
+      <w:bookmarkStart w:id="17" w:name="_Toc225930497"/>
+    </w:p>
+    <w:p>
+      <w:pPr>
+        <w:rPr>
+          <w:i/>
+          <w:iCs/>
+          <w:lang w:val="en-US"/>
+        </w:rPr>
+      </w:pPr>
+    </w:p>
+    <w:p>
+      <w:pPr>
+        <w:rPr>
+          <w:i/>
+          <w:iCs/>
+          <w:lang w:val="en-US"/>
+        </w:rPr>
+      </w:pPr>
+    </w:p>
+    <w:p>
+      <w:pPr>
+        <w:pStyle w:val="Heading3"/>
+        <w:rPr>
+          <w:b/>
+          <w:bCs/>
+          <w:color w:val="auto"/>
+          <w:sz w:val="24"/>
+          <w:szCs w:val="24"/>
+          <w:lang w:val="en-US"/>
+        </w:rPr>
+      </w:pPr>
+      <w:r>
+        <w:rPr>
+          <w:b/>
+          <w:bCs/>
+          <w:color w:val="auto"/>
+          <w:sz w:val="24"/>
+          <w:szCs w:val="24"/>
+          <w:lang w:val="en-US"/>
+        </w:rPr>
+        <w:lastRenderedPageBreak/>
+        <w:t xml:space="preserve">Crafting </w:t>
+      </w:r>
+      <w:r>
+        <w:rPr>
+          <w:b/>
+          <w:bCs/>
+          <w:color w:val="auto"/>
+          <w:sz w:val="24"/>
+          <w:szCs w:val="24"/>
+          <w:lang w:val="en-US"/>
+        </w:rPr>
+        <w:t>Johns Pattern Matching mini-game</w:t>
+      </w:r>
+      <w:r>
+        <w:rPr>
+          <w:b/>
+          <w:bCs/>
+          <w:color w:val="auto"/>
+          <w:sz w:val="24"/>
+          <w:szCs w:val="24"/>
+          <w:lang w:val="en-US"/>
+        </w:rPr>
+        <w:t xml:space="preserve">: </w:t>
+      </w:r>
+    </w:p>
+    <w:p>
+      <w:pPr>
+        <w:rPr>
+          <w:lang w:val="en-US"/>
+        </w:rPr>
+      </w:pPr>
+      <w:r>
+        <w:rPr>
+          <w:lang w:val="en-US"/>
+        </w:rPr>
+        <w:t xml:space="preserve">The first part of Johns page contains a drop down menu game, where the player must select the options in order. The list of words will appear in a random order, and the player must select the item from the drop-down menus in the correct order. </w:t>
+      </w:r>
+      <w:r>
+        <w:rPr>
+          <w:lang w:val="en-US"/>
+        </w:rPr>
+        <w:t xml:space="preserve">Failure to do things in the correct order will result in the player needing to restart the mini-game. </w:t>
+      </w:r>
+      <w:r>
+        <w:rPr>
+          <w:lang w:val="en-US"/>
+        </w:rPr>
+        <w:t xml:space="preserve">They will have 9 rounds, where they initially start with 3 drop-downs, and a drop-down is added after every 3 rounds. </w:t>
+      </w:r>
+      <w:r>
+        <w:rPr>
+          <w:lang w:val="en-US"/>
+        </w:rPr>
+        <w:t xml:space="preserve">Players will have to click on the correct options in the correct order. </w:t>
+      </w:r>
     </w:p>
     <w:p>
       <w:pPr>
@@ -4122,42 +4113,8 @@
           <w:color w:val="auto"/>
         </w:rPr>
       </w:pPr>
-      <w:bookmarkStart w:id="17" w:name="_Toc225930497"/>
-    </w:p>
-    <w:p>
-      <w:pPr>
-        <w:pStyle w:val="Heading2"/>
-        <w:rPr>
-          <w:b/>
-          <w:bCs/>
-          <w:color w:val="auto"/>
-        </w:rPr>
-      </w:pPr>
-      <w:r>
-        <w:rPr>
-          <w:b/>
-          <w:bCs/>
-          <w:color w:val="auto"/>
-        </w:rPr>
-        <w:t>AI</w:t>
-      </w:r>
+      <w:bookmarkStart w:id="18" w:name="_Toc225930498"/>
       <w:bookmarkEnd w:id="17"/>
-    </w:p>
-    <w:p>
-      <w:r>
-        <w:t xml:space="preserve">None. </w:t>
-      </w:r>
-    </w:p>
-    <w:p>
-      <w:pPr>
-        <w:pStyle w:val="Heading2"/>
-        <w:rPr>
-          <w:b/>
-          <w:bCs/>
-          <w:color w:val="auto"/>
-        </w:rPr>
-      </w:pPr>
-      <w:bookmarkStart w:id="18" w:name="_Toc225930498"/>
       <w:r>
         <w:rPr>
           <w:b/>

</xml_diff>